<commit_message>
fixed regressions and weather
</commit_message>
<xml_diff>
--- a/docs/content/weather/weather_lecture.docx
+++ b/docs/content/weather/weather_lecture.docx
@@ -532,7 +532,7 @@
         <w:t xml:space="preserve"> </w:t>
       </w:r>
       <w:r>
-        <w:t xml:space="preserve">~28,000 daily records into one mean per year</w:t>
+        <w:t xml:space="preserve">~25,000 daily records into one mean per year</w:t>
       </w:r>
     </w:p>
     <w:p>
@@ -805,7 +805,28 @@
         <w:t xml:space="preserve"> </w:t>
       </w:r>
       <w:r>
-        <w:t xml:space="preserve">— download NOAA station data</w:t>
+        <w:t xml:space="preserve">— NOAA station data (Duluth)</w:t>
+      </w:r>
+    </w:p>
+    <w:p>
+      <w:pPr>
+        <w:pStyle w:val="Compact"/>
+        <w:numPr>
+          <w:ilvl w:val="0"/>
+          <w:numId w:val="1007"/>
+        </w:numPr>
+      </w:pPr>
+      <w:r>
+        <w:rPr>
+          <w:rStyle w:val="VerbatimChar"/>
+        </w:rPr>
+        <w:t xml:space="preserve">nasapower</w:t>
+      </w:r>
+      <w:r>
+        <w:t xml:space="preserve"> </w:t>
+      </w:r>
+      <w:r>
+        <w:t xml:space="preserve">— data by lat/long (your city)</w:t>
       </w:r>
     </w:p>
     <w:p>
@@ -1221,6 +1242,34 @@
     </w:p>
     <w:p>
       <w:pPr>
+        <w:pStyle w:val="Compact"/>
+        <w:numPr>
+          <w:ilvl w:val="1"/>
+          <w:numId w:val="1013"/>
+        </w:numPr>
+      </w:pPr>
+      <w:r>
+        <w:t xml:space="preserve">it warns GSOD</w:t>
+      </w:r>
+      <w:r>
+        <w:t xml:space="preserve"> </w:t>
+      </w:r>
+      <w:r>
+        <w:rPr>
+          <w:b/>
+          <w:bCs/>
+        </w:rPr>
+        <w:t xml:space="preserve">retired in Aug 2025</w:t>
+      </w:r>
+      <w:r>
+        <w:t xml:space="preserve"> </w:t>
+      </w:r>
+      <w:r>
+        <w:t xml:space="preserve">— expected; the archive still works</w:t>
+      </w:r>
+    </w:p>
+    <w:p>
+      <w:pPr>
         <w:pStyle w:val="FirstParagraph"/>
       </w:pPr>
       <w:r>
@@ -1275,17 +1324,39 @@
         </w:numPr>
       </w:pPr>
       <w:r>
-        <w:t xml:space="preserve">Daily records since</w:t>
-      </w:r>
-      <w:r>
-        <w:t xml:space="preserve"> </w:t>
-      </w:r>
-      <w:r>
-        <w:rPr>
-          <w:b/>
-          <w:bCs/>
-        </w:rPr>
-        <w:t xml:space="preserve">1948</w:t>
+        <w:t xml:space="preserve">Daily records</w:t>
+      </w:r>
+      <w:r>
+        <w:t xml:space="preserve"> </w:t>
+      </w:r>
+      <w:r>
+        <w:rPr>
+          <w:b/>
+          <w:bCs/>
+        </w:rPr>
+        <w:t xml:space="preserve">1948–2024</w:t>
+      </w:r>
+    </w:p>
+    <w:p>
+      <w:pPr>
+        <w:pStyle w:val="Compact"/>
+        <w:numPr>
+          <w:ilvl w:val="1"/>
+          <w:numId w:val="1015"/>
+        </w:numPr>
+      </w:pPr>
+      <w:r>
+        <w:rPr>
+          <w:b/>
+          <w:bCs/>
+        </w:rPr>
+        <w:t xml:space="preserve">1965–1972 missing</w:t>
+      </w:r>
+      <w:r>
+        <w:t xml:space="preserve"> </w:t>
+      </w:r>
+      <w:r>
+        <w:t xml:space="preserve">— a different station ID back then</w:t>
       </w:r>
     </w:p>
     <w:p>
@@ -1293,7 +1364,7 @@
         <w:pStyle w:val="Compact"/>
         <w:numPr>
           <w:ilvl w:val="0"/>
-          <w:numId w:val="1015"/>
+          <w:numId w:val="1016"/>
         </w:numPr>
       </w:pPr>
       <w:r>
@@ -1302,46 +1373,6 @@
           <w:bCs/>
         </w:rPr>
         <w:t xml:space="preserve">Why this matters:</w:t>
-      </w:r>
-    </w:p>
-    <w:p>
-      <w:pPr>
-        <w:pStyle w:val="Compact"/>
-        <w:numPr>
-          <w:ilvl w:val="1"/>
-          <w:numId w:val="1016"/>
-        </w:numPr>
-      </w:pPr>
-      <w:r>
-        <w:t xml:space="preserve">this is the same messy, real-world data you will meet in your own project</w:t>
-      </w:r>
-    </w:p>
-    <w:p>
-      <w:pPr>
-        <w:pStyle w:val="Compact"/>
-        <w:numPr>
-          <w:ilvl w:val="1"/>
-          <w:numId w:val="1016"/>
-        </w:numPr>
-      </w:pPr>
-      <w:r>
-        <w:t xml:space="preserve">the workflow — download → summarize → model — is the one you will reuse all term</w:t>
-      </w:r>
-    </w:p>
-    <w:p>
-      <w:pPr>
-        <w:pStyle w:val="Compact"/>
-        <w:numPr>
-          <w:ilvl w:val="0"/>
-          <w:numId w:val="1015"/>
-        </w:numPr>
-      </w:pPr>
-      <w:r>
-        <w:rPr>
-          <w:b/>
-          <w:bCs/>
-        </w:rPr>
-        <w:t xml:space="preserve">And it is yours to reuse:</w:t>
       </w:r>
     </w:p>
     <w:p>
@@ -1353,7 +1384,7 @@
         </w:numPr>
       </w:pPr>
       <w:r>
-        <w:t xml:space="preserve">every city with a long station record can be run through the exact same code</w:t>
+        <w:t xml:space="preserve">this is the same messy, real-world data you will meet in your own project</w:t>
       </w:r>
     </w:p>
     <w:p>
@@ -1362,6 +1393,46 @@
         <w:numPr>
           <w:ilvl w:val="1"/>
           <w:numId w:val="1017"/>
+        </w:numPr>
+      </w:pPr>
+      <w:r>
+        <w:t xml:space="preserve">the workflow — download → summarize → model — is the one you will reuse all term</w:t>
+      </w:r>
+    </w:p>
+    <w:p>
+      <w:pPr>
+        <w:pStyle w:val="Compact"/>
+        <w:numPr>
+          <w:ilvl w:val="0"/>
+          <w:numId w:val="1016"/>
+        </w:numPr>
+      </w:pPr>
+      <w:r>
+        <w:rPr>
+          <w:b/>
+          <w:bCs/>
+        </w:rPr>
+        <w:t xml:space="preserve">And it is yours to reuse:</w:t>
+      </w:r>
+    </w:p>
+    <w:p>
+      <w:pPr>
+        <w:pStyle w:val="Compact"/>
+        <w:numPr>
+          <w:ilvl w:val="1"/>
+          <w:numId w:val="1018"/>
+        </w:numPr>
+      </w:pPr>
+      <w:r>
+        <w:t xml:space="preserve">every city with a long station record can be run through the exact same code</w:t>
+      </w:r>
+    </w:p>
+    <w:p>
+      <w:pPr>
+        <w:pStyle w:val="Compact"/>
+        <w:numPr>
+          <w:ilvl w:val="1"/>
+          <w:numId w:val="1018"/>
         </w:numPr>
       </w:pPr>
       <w:r>
@@ -1464,7 +1535,7 @@
         <w:pStyle w:val="Compact"/>
         <w:numPr>
           <w:ilvl w:val="0"/>
-          <w:numId w:val="1018"/>
+          <w:numId w:val="1019"/>
         </w:numPr>
       </w:pPr>
       <w:r>
@@ -1567,7 +1638,7 @@
         <w:pStyle w:val="Compact"/>
         <w:numPr>
           <w:ilvl w:val="0"/>
-          <w:numId w:val="1019"/>
+          <w:numId w:val="1020"/>
         </w:numPr>
       </w:pPr>
       <w:r>
@@ -1633,7 +1704,7 @@
         <w:pStyle w:val="Compact"/>
         <w:numPr>
           <w:ilvl w:val="0"/>
-          <w:numId w:val="1020"/>
+          <w:numId w:val="1021"/>
         </w:numPr>
       </w:pPr>
       <w:r>
@@ -1649,7 +1720,7 @@
         <w:pStyle w:val="Compact"/>
         <w:numPr>
           <w:ilvl w:val="1"/>
-          <w:numId w:val="1021"/>
+          <w:numId w:val="1022"/>
         </w:numPr>
       </w:pPr>
       <w:r>
@@ -1681,7 +1752,7 @@
         <w:pStyle w:val="Compact"/>
         <w:numPr>
           <w:ilvl w:val="1"/>
-          <w:numId w:val="1021"/>
+          <w:numId w:val="1022"/>
         </w:numPr>
       </w:pPr>
       <w:r>
@@ -1713,7 +1784,7 @@
         <w:pStyle w:val="Compact"/>
         <w:numPr>
           <w:ilvl w:val="1"/>
-          <w:numId w:val="1021"/>
+          <w:numId w:val="1022"/>
         </w:numPr>
       </w:pPr>
       <w:r>
@@ -1735,7 +1806,7 @@
         <w:pStyle w:val="Compact"/>
         <w:numPr>
           <w:ilvl w:val="0"/>
-          <w:numId w:val="1020"/>
+          <w:numId w:val="1021"/>
         </w:numPr>
       </w:pPr>
       <w:r>
@@ -1757,7 +1828,7 @@
         <w:pStyle w:val="Compact"/>
         <w:numPr>
           <w:ilvl w:val="1"/>
-          <w:numId w:val="1022"/>
+          <w:numId w:val="1023"/>
         </w:numPr>
       </w:pPr>
       <w:r>
@@ -1789,7 +1860,7 @@
         <w:pStyle w:val="Compact"/>
         <w:numPr>
           <w:ilvl w:val="1"/>
-          <w:numId w:val="1022"/>
+          <w:numId w:val="1023"/>
         </w:numPr>
       </w:pPr>
       <w:r>
@@ -1811,7 +1882,7 @@
         <w:pStyle w:val="Compact"/>
         <w:numPr>
           <w:ilvl w:val="0"/>
-          <w:numId w:val="1020"/>
+          <w:numId w:val="1021"/>
         </w:numPr>
       </w:pPr>
       <w:r>
@@ -1850,7 +1921,7 @@
         <w:pStyle w:val="Compact"/>
         <w:numPr>
           <w:ilvl w:val="1"/>
-          <w:numId w:val="1023"/>
+          <w:numId w:val="1024"/>
         </w:numPr>
       </w:pPr>
       <w:r>
@@ -1862,7 +1933,7 @@
         <w:pStyle w:val="Compact"/>
         <w:numPr>
           <w:ilvl w:val="1"/>
-          <w:numId w:val="1023"/>
+          <w:numId w:val="1024"/>
         </w:numPr>
       </w:pPr>
       <w:r>
@@ -1900,7 +1971,7 @@
         <w:pStyle w:val="Compact"/>
         <w:numPr>
           <w:ilvl w:val="0"/>
-          <w:numId w:val="1024"/>
+          <w:numId w:val="1025"/>
         </w:numPr>
       </w:pPr>
       <w:r>
@@ -1915,50 +1986,6 @@
           <w:bCs/>
         </w:rPr>
         <w:t xml:space="preserve">one row per day</w:t>
-      </w:r>
-    </w:p>
-    <w:p>
-      <w:pPr>
-        <w:pStyle w:val="Compact"/>
-        <w:numPr>
-          <w:ilvl w:val="1"/>
-          <w:numId w:val="1025"/>
-        </w:numPr>
-      </w:pPr>
-      <w:r>
-        <w:t xml:space="preserve">78 years × 365 days ≈</w:t>
-      </w:r>
-      <w:r>
-        <w:t xml:space="preserve"> </w:t>
-      </w:r>
-      <w:r>
-        <w:rPr>
-          <w:b/>
-          <w:bCs/>
-        </w:rPr>
-        <w:t xml:space="preserve">28,000 rows</w:t>
-      </w:r>
-    </w:p>
-    <w:p>
-      <w:pPr>
-        <w:pStyle w:val="Compact"/>
-        <w:numPr>
-          <w:ilvl w:val="0"/>
-          <w:numId w:val="1024"/>
-        </w:numPr>
-      </w:pPr>
-      <w:r>
-        <w:t xml:space="preserve">Every one of those days carries the</w:t>
-      </w:r>
-      <w:r>
-        <w:t xml:space="preserve"> </w:t>
-      </w:r>
-      <w:r>
-        <w:rPr>
-          <w:b/>
-          <w:bCs/>
-        </w:rPr>
-        <w:t xml:space="preserve">seasonal cycle</w:t>
       </w:r>
     </w:p>
     <w:p>
@@ -1970,6 +1997,50 @@
         </w:numPr>
       </w:pPr>
       <w:r>
+        <w:t xml:space="preserve">69 years × 365 days ≈</w:t>
+      </w:r>
+      <w:r>
+        <w:t xml:space="preserve"> </w:t>
+      </w:r>
+      <w:r>
+        <w:rPr>
+          <w:b/>
+          <w:bCs/>
+        </w:rPr>
+        <w:t xml:space="preserve">25,000 rows</w:t>
+      </w:r>
+    </w:p>
+    <w:p>
+      <w:pPr>
+        <w:pStyle w:val="Compact"/>
+        <w:numPr>
+          <w:ilvl w:val="0"/>
+          <w:numId w:val="1025"/>
+        </w:numPr>
+      </w:pPr>
+      <w:r>
+        <w:t xml:space="preserve">Every one of those days carries the</w:t>
+      </w:r>
+      <w:r>
+        <w:t xml:space="preserve"> </w:t>
+      </w:r>
+      <w:r>
+        <w:rPr>
+          <w:b/>
+          <w:bCs/>
+        </w:rPr>
+        <w:t xml:space="preserve">seasonal cycle</w:t>
+      </w:r>
+    </w:p>
+    <w:p>
+      <w:pPr>
+        <w:pStyle w:val="Compact"/>
+        <w:numPr>
+          <w:ilvl w:val="1"/>
+          <w:numId w:val="1027"/>
+        </w:numPr>
+      </w:pPr>
+      <w:r>
         <w:t xml:space="preserve">January is 30 °C colder than July, every single year</w:t>
       </w:r>
     </w:p>
@@ -1978,7 +2049,7 @@
         <w:pStyle w:val="Compact"/>
         <w:numPr>
           <w:ilvl w:val="1"/>
-          <w:numId w:val="1026"/>
+          <w:numId w:val="1027"/>
         </w:numPr>
       </w:pPr>
       <w:r>
@@ -1990,7 +2061,7 @@
         <w:pStyle w:val="Compact"/>
         <w:numPr>
           <w:ilvl w:val="0"/>
-          <w:numId w:val="1024"/>
+          <w:numId w:val="1025"/>
         </w:numPr>
       </w:pPr>
       <w:r>
@@ -2096,7 +2167,7 @@
               <w:pStyle w:val="Compact"/>
             </w:pPr>
             <w:r>
-              <w:t xml:space="preserve">~28,000</w:t>
+              <w:t xml:space="preserve">~25,000</w:t>
             </w:r>
           </w:p>
         </w:tc>
@@ -2142,7 +2213,7 @@
                 <w:b/>
                 <w:bCs/>
               </w:rPr>
-              <w:t xml:space="preserve">78</w:t>
+              <w:t xml:space="preserve">69</w:t>
             </w:r>
           </w:p>
         </w:tc>
@@ -2269,7 +2340,7 @@
               <w:pStyle w:val="Compact"/>
               <w:numPr>
                 <w:ilvl w:val="0"/>
-                <w:numId w:val="1027"/>
+                <w:numId w:val="1028"/>
               </w:numPr>
             </w:pPr>
             <w:r>
@@ -2297,7 +2368,7 @@
               <w:pStyle w:val="Compact"/>
               <w:numPr>
                 <w:ilvl w:val="0"/>
-                <w:numId w:val="1027"/>
+                <w:numId w:val="1028"/>
               </w:numPr>
             </w:pPr>
             <w:r>
@@ -2319,7 +2390,7 @@
               <w:pStyle w:val="Compact"/>
               <w:numPr>
                 <w:ilvl w:val="0"/>
-                <w:numId w:val="1027"/>
+                <w:numId w:val="1028"/>
               </w:numPr>
             </w:pPr>
             <w:r>
@@ -2345,7 +2416,7 @@
         <w:pStyle w:val="Compact"/>
         <w:numPr>
           <w:ilvl w:val="0"/>
-          <w:numId w:val="1028"/>
+          <w:numId w:val="1029"/>
         </w:numPr>
       </w:pPr>
       <w:r>
@@ -2372,7 +2443,7 @@
         <w:pStyle w:val="Compact"/>
         <w:numPr>
           <w:ilvl w:val="0"/>
-          <w:numId w:val="1028"/>
+          <w:numId w:val="1029"/>
         </w:numPr>
       </w:pPr>
       <w:r>
@@ -2470,7 +2541,7 @@
         <w:rPr>
           <w:rStyle w:val="NormalTok"/>
         </w:rPr>
-        <w:t xml:space="preserve">(tidyverse) </w:t>
+        <w:t xml:space="preserve">(tidyverse)  </w:t>
       </w:r>
       <w:r>
         <w:rPr>
@@ -2491,7 +2562,7 @@
         <w:rPr>
           <w:rStyle w:val="NormalTok"/>
         </w:rPr>
-        <w:t xml:space="preserve">(janitor)   </w:t>
+        <w:t xml:space="preserve">(janitor)    </w:t>
       </w:r>
       <w:r>
         <w:rPr>
@@ -2512,13 +2583,34 @@
         <w:rPr>
           <w:rStyle w:val="NormalTok"/>
         </w:rPr>
-        <w:t xml:space="preserve">(GSODR)     </w:t>
+        <w:t xml:space="preserve">(GSODR)      </w:t>
       </w:r>
       <w:r>
         <w:rPr>
           <w:rStyle w:val="CommentTok"/>
         </w:rPr>
-        <w:t xml:space="preserve"># NOAA weather station data</w:t>
+        <w:t xml:space="preserve"># NOAA station data - Duluth</w:t>
+      </w:r>
+      <w:r>
+        <w:br/>
+      </w:r>
+      <w:r>
+        <w:rPr>
+          <w:rStyle w:val="FunctionTok"/>
+        </w:rPr>
+        <w:t xml:space="preserve">library</w:t>
+      </w:r>
+      <w:r>
+        <w:rPr>
+          <w:rStyle w:val="NormalTok"/>
+        </w:rPr>
+        <w:t xml:space="preserve">(nasapower)  </w:t>
+      </w:r>
+      <w:r>
+        <w:rPr>
+          <w:rStyle w:val="CommentTok"/>
+        </w:rPr>
+        <w:t xml:space="preserve"># NASA data by lat/long - your city</w:t>
       </w:r>
     </w:p>
     <w:p>
@@ -2529,7 +2621,7 @@
         <w:rPr>
           <w:rStyle w:val="CommentTok"/>
         </w:rPr>
-        <w:t xml:space="preserve"># Download daily Duluth weather, 1948-2025 -------------</w:t>
+        <w:t xml:space="preserve"># Download daily Duluth weather, 1948-2024 -------------</w:t>
       </w:r>
       <w:r>
         <w:br/>
@@ -2538,7 +2630,49 @@
         <w:rPr>
           <w:rStyle w:val="CommentTok"/>
         </w:rPr>
-        <w:t xml:space="preserve"># clean_names() makes every column lower case</w:t>
+        <w:t xml:space="preserve"># 1965-1972 are missing for this station, so skip them</w:t>
+      </w:r>
+      <w:r>
+        <w:br/>
+      </w:r>
+      <w:r>
+        <w:rPr>
+          <w:rStyle w:val="NormalTok"/>
+        </w:rPr>
+        <w:t xml:space="preserve">gap_years </w:t>
+      </w:r>
+      <w:r>
+        <w:rPr>
+          <w:rStyle w:val="OtherTok"/>
+        </w:rPr>
+        <w:t xml:space="preserve">&lt;-</w:t>
+      </w:r>
+      <w:r>
+        <w:rPr>
+          <w:rStyle w:val="NormalTok"/>
+        </w:rPr>
+        <w:t xml:space="preserve"> </w:t>
+      </w:r>
+      <w:r>
+        <w:rPr>
+          <w:rStyle w:val="DecValTok"/>
+        </w:rPr>
+        <w:t xml:space="preserve">1965</w:t>
+      </w:r>
+      <w:r>
+        <w:rPr>
+          <w:rStyle w:val="SpecialCharTok"/>
+        </w:rPr>
+        <w:t xml:space="preserve">:</w:t>
+      </w:r>
+      <w:r>
+        <w:rPr>
+          <w:rStyle w:val="DecValTok"/>
+        </w:rPr>
+        <w:t xml:space="preserve">1972</w:t>
+      </w:r>
+      <w:r>
+        <w:br/>
       </w:r>
       <w:r>
         <w:br/>
@@ -2587,6 +2721,18 @@
       </w:r>
       <w:r>
         <w:rPr>
+          <w:rStyle w:val="FunctionTok"/>
+        </w:rPr>
+        <w:t xml:space="preserve">setdiff</w:t>
+      </w:r>
+      <w:r>
+        <w:rPr>
+          <w:rStyle w:val="NormalTok"/>
+        </w:rPr>
+        <w:t xml:space="preserve">(</w:t>
+      </w:r>
+      <w:r>
+        <w:rPr>
           <w:rStyle w:val="DecValTok"/>
         </w:rPr>
         <w:t xml:space="preserve">1948</w:t>
@@ -2601,13 +2747,13 @@
         <w:rPr>
           <w:rStyle w:val="DecValTok"/>
         </w:rPr>
-        <w:t xml:space="preserve">2025</w:t>
-      </w:r>
-      <w:r>
-        <w:rPr>
-          <w:rStyle w:val="NormalTok"/>
-        </w:rPr>
-        <w:t xml:space="preserve">,</w:t>
+        <w:t xml:space="preserve">2024</w:t>
+      </w:r>
+      <w:r>
+        <w:rPr>
+          <w:rStyle w:val="NormalTok"/>
+        </w:rPr>
+        <w:t xml:space="preserve">, gap_years),</w:t>
       </w:r>
       <w:r>
         <w:br/>
@@ -2675,7 +2821,7 @@
         <w:pStyle w:val="Compact"/>
         <w:numPr>
           <w:ilvl w:val="0"/>
-          <w:numId w:val="1029"/>
+          <w:numId w:val="1030"/>
         </w:numPr>
       </w:pPr>
       <w:r>
@@ -2721,76 +2867,6 @@
       </w:r>
       <w:r>
         <w:t xml:space="preserve">and goes and gets the data</w:t>
-      </w:r>
-    </w:p>
-    <w:p>
-      <w:pPr>
-        <w:pStyle w:val="Compact"/>
-        <w:numPr>
-          <w:ilvl w:val="1"/>
-          <w:numId w:val="1030"/>
-        </w:numPr>
-      </w:pPr>
-      <w:r>
-        <w:rPr>
-          <w:rStyle w:val="VerbatimChar"/>
-        </w:rPr>
-        <w:t xml:space="preserve">1948:2025</w:t>
-      </w:r>
-      <w:r>
-        <w:t xml:space="preserve"> </w:t>
-      </w:r>
-      <w:r>
-        <w:t xml:space="preserve">is a vector —</w:t>
-      </w:r>
-      <w:r>
-        <w:t xml:space="preserve"> </w:t>
-      </w:r>
-      <w:r>
-        <w:t xml:space="preserve">“every year in this range”</w:t>
-      </w:r>
-    </w:p>
-    <w:p>
-      <w:pPr>
-        <w:pStyle w:val="Compact"/>
-        <w:numPr>
-          <w:ilvl w:val="1"/>
-          <w:numId w:val="1030"/>
-        </w:numPr>
-      </w:pPr>
-      <w:r>
-        <w:t xml:space="preserve">it takes a minute; 78 years of daily data is a lot</w:t>
-      </w:r>
-    </w:p>
-    <w:p>
-      <w:pPr>
-        <w:pStyle w:val="Compact"/>
-        <w:numPr>
-          <w:ilvl w:val="0"/>
-          <w:numId w:val="1029"/>
-        </w:numPr>
-      </w:pPr>
-      <w:r>
-        <w:rPr>
-          <w:rStyle w:val="VerbatimChar"/>
-          <w:b/>
-          <w:bCs/>
-        </w:rPr>
-        <w:t xml:space="preserve">clean_names()</w:t>
-      </w:r>
-      <w:r>
-        <w:rPr>
-          <w:b/>
-          <w:bCs/>
-        </w:rPr>
-        <w:t xml:space="preserve"> </w:t>
-      </w:r>
-      <w:r>
-        <w:rPr>
-          <w:b/>
-          <w:bCs/>
-        </w:rPr>
-        <w:t xml:space="preserve">is the important habit here</w:t>
       </w:r>
     </w:p>
     <w:p>
@@ -2802,40 +2878,22 @@
         </w:numPr>
       </w:pPr>
       <w:r>
-        <w:t xml:space="preserve">NOAA ships columns as</w:t>
-      </w:r>
-      <w:r>
-        <w:t xml:space="preserve"> </w:t>
-      </w:r>
-      <w:r>
-        <w:rPr>
-          <w:rStyle w:val="VerbatimChar"/>
-        </w:rPr>
-        <w:t xml:space="preserve">TEMP</w:t>
-      </w:r>
-      <w:r>
-        <w:t xml:space="preserve">,</w:t>
-      </w:r>
-      <w:r>
-        <w:t xml:space="preserve"> </w:t>
-      </w:r>
-      <w:r>
-        <w:rPr>
-          <w:rStyle w:val="VerbatimChar"/>
-        </w:rPr>
-        <w:t xml:space="preserve">YEARMODA</w:t>
-      </w:r>
-      <w:r>
-        <w:t xml:space="preserve">,</w:t>
-      </w:r>
-      <w:r>
-        <w:t xml:space="preserve"> </w:t>
-      </w:r>
-      <w:r>
-        <w:rPr>
-          <w:rStyle w:val="VerbatimChar"/>
-        </w:rPr>
-        <w:t xml:space="preserve">MXSPD</w:t>
+        <w:rPr>
+          <w:rStyle w:val="VerbatimChar"/>
+        </w:rPr>
+        <w:t xml:space="preserve">1948:2024</w:t>
+      </w:r>
+      <w:r>
+        <w:t xml:space="preserve"> </w:t>
+      </w:r>
+      <w:r>
+        <w:t xml:space="preserve">is a vector —</w:t>
+      </w:r>
+      <w:r>
+        <w:t xml:space="preserve"> </w:t>
+      </w:r>
+      <w:r>
+        <w:t xml:space="preserve">“every year in this range”</w:t>
       </w:r>
     </w:p>
     <w:p>
@@ -2847,22 +2905,38 @@
         </w:numPr>
       </w:pPr>
       <w:r>
-        <w:t xml:space="preserve">R is case-sensitive, so</w:t>
-      </w:r>
-      <w:r>
-        <w:t xml:space="preserve"> </w:t>
-      </w:r>
-      <w:r>
-        <w:rPr>
-          <w:rStyle w:val="VerbatimChar"/>
-        </w:rPr>
-        <w:t xml:space="preserve">temp</w:t>
-      </w:r>
-      <w:r>
-        <w:t xml:space="preserve"> </w:t>
-      </w:r>
-      <w:r>
-        <w:t xml:space="preserve">would error</w:t>
+        <w:rPr>
+          <w:rStyle w:val="VerbatimChar"/>
+        </w:rPr>
+        <w:t xml:space="preserve">setdiff()</w:t>
+      </w:r>
+      <w:r>
+        <w:t xml:space="preserve"> </w:t>
+      </w:r>
+      <w:r>
+        <w:t xml:space="preserve">removes the 8 missing years from that vector</w:t>
+      </w:r>
+    </w:p>
+    <w:p>
+      <w:pPr>
+        <w:pStyle w:val="Compact"/>
+        <w:numPr>
+          <w:ilvl w:val="2"/>
+          <w:numId w:val="1032"/>
+        </w:numPr>
+      </w:pPr>
+      <w:r>
+        <w:t xml:space="preserve">ask for a year the station does not have and the</w:t>
+      </w:r>
+      <w:r>
+        <w:t xml:space="preserve"> </w:t>
+      </w:r>
+      <w:r>
+        <w:rPr>
+          <w:b/>
+          <w:bCs/>
+        </w:rPr>
+        <w:t xml:space="preserve">whole download fails</w:t>
       </w:r>
     </w:p>
     <w:p>
@@ -2871,6 +2945,121 @@
         <w:numPr>
           <w:ilvl w:val="1"/>
           <w:numId w:val="1031"/>
+        </w:numPr>
+      </w:pPr>
+      <w:r>
+        <w:t xml:space="preserve">it takes a minute; 69 years of daily data is a lot</w:t>
+      </w:r>
+    </w:p>
+    <w:p>
+      <w:pPr>
+        <w:pStyle w:val="Compact"/>
+        <w:numPr>
+          <w:ilvl w:val="0"/>
+          <w:numId w:val="1030"/>
+        </w:numPr>
+      </w:pPr>
+      <w:r>
+        <w:rPr>
+          <w:rStyle w:val="VerbatimChar"/>
+          <w:b/>
+          <w:bCs/>
+        </w:rPr>
+        <w:t xml:space="preserve">clean_names()</w:t>
+      </w:r>
+      <w:r>
+        <w:rPr>
+          <w:b/>
+          <w:bCs/>
+        </w:rPr>
+        <w:t xml:space="preserve"> </w:t>
+      </w:r>
+      <w:r>
+        <w:rPr>
+          <w:b/>
+          <w:bCs/>
+        </w:rPr>
+        <w:t xml:space="preserve">is the important habit here</w:t>
+      </w:r>
+    </w:p>
+    <w:p>
+      <w:pPr>
+        <w:pStyle w:val="Compact"/>
+        <w:numPr>
+          <w:ilvl w:val="1"/>
+          <w:numId w:val="1033"/>
+        </w:numPr>
+      </w:pPr>
+      <w:r>
+        <w:t xml:space="preserve">NOAA ships columns as</w:t>
+      </w:r>
+      <w:r>
+        <w:t xml:space="preserve"> </w:t>
+      </w:r>
+      <w:r>
+        <w:rPr>
+          <w:rStyle w:val="VerbatimChar"/>
+        </w:rPr>
+        <w:t xml:space="preserve">TEMP</w:t>
+      </w:r>
+      <w:r>
+        <w:t xml:space="preserve">,</w:t>
+      </w:r>
+      <w:r>
+        <w:t xml:space="preserve"> </w:t>
+      </w:r>
+      <w:r>
+        <w:rPr>
+          <w:rStyle w:val="VerbatimChar"/>
+        </w:rPr>
+        <w:t xml:space="preserve">YEARMODA</w:t>
+      </w:r>
+      <w:r>
+        <w:t xml:space="preserve">,</w:t>
+      </w:r>
+      <w:r>
+        <w:t xml:space="preserve"> </w:t>
+      </w:r>
+      <w:r>
+        <w:rPr>
+          <w:rStyle w:val="VerbatimChar"/>
+        </w:rPr>
+        <w:t xml:space="preserve">MXSPD</w:t>
+      </w:r>
+    </w:p>
+    <w:p>
+      <w:pPr>
+        <w:pStyle w:val="Compact"/>
+        <w:numPr>
+          <w:ilvl w:val="1"/>
+          <w:numId w:val="1033"/>
+        </w:numPr>
+      </w:pPr>
+      <w:r>
+        <w:t xml:space="preserve">R is case-sensitive, so</w:t>
+      </w:r>
+      <w:r>
+        <w:t xml:space="preserve"> </w:t>
+      </w:r>
+      <w:r>
+        <w:rPr>
+          <w:rStyle w:val="VerbatimChar"/>
+        </w:rPr>
+        <w:t xml:space="preserve">temp</w:t>
+      </w:r>
+      <w:r>
+        <w:t xml:space="preserve"> </w:t>
+      </w:r>
+      <w:r>
+        <w:t xml:space="preserve">would error</w:t>
+      </w:r>
+    </w:p>
+    <w:p>
+      <w:pPr>
+        <w:pStyle w:val="Compact"/>
+        <w:numPr>
+          <w:ilvl w:val="1"/>
+          <w:numId w:val="1033"/>
         </w:numPr>
       </w:pPr>
       <w:r>
@@ -3106,15 +3295,15 @@
         <w:pStyle w:val="Compact"/>
         <w:numPr>
           <w:ilvl w:val="0"/>
-          <w:numId w:val="1032"/>
-        </w:numPr>
-      </w:pPr>
-      <w:r>
-        <w:rPr>
-          <w:b/>
-          <w:bCs/>
-        </w:rPr>
-        <w:t xml:space="preserve">~28,000 rows</w:t>
+          <w:numId w:val="1034"/>
+        </w:numPr>
+      </w:pPr>
+      <w:r>
+        <w:rPr>
+          <w:b/>
+          <w:bCs/>
+        </w:rPr>
+        <w:t xml:space="preserve">~25,000 rows</w:t>
       </w:r>
       <w:r>
         <w:t xml:space="preserve"> </w:t>
@@ -3128,7 +3317,7 @@
         <w:pStyle w:val="Compact"/>
         <w:numPr>
           <w:ilvl w:val="0"/>
-          <w:numId w:val="1032"/>
+          <w:numId w:val="1034"/>
         </w:numPr>
       </w:pPr>
       <w:r>
@@ -3150,7 +3339,7 @@
         <w:pStyle w:val="Compact"/>
         <w:numPr>
           <w:ilvl w:val="0"/>
-          <w:numId w:val="1032"/>
+          <w:numId w:val="1034"/>
         </w:numPr>
       </w:pPr>
       <w:r>
@@ -3162,7 +3351,7 @@
         <w:pStyle w:val="Compact"/>
         <w:numPr>
           <w:ilvl w:val="1"/>
-          <w:numId w:val="1033"/>
+          <w:numId w:val="1035"/>
         </w:numPr>
       </w:pPr>
       <w:r>
@@ -3183,7 +3372,7 @@
         <w:pStyle w:val="Compact"/>
         <w:numPr>
           <w:ilvl w:val="1"/>
-          <w:numId w:val="1033"/>
+          <w:numId w:val="1035"/>
         </w:numPr>
       </w:pPr>
       <w:r>
@@ -3222,7 +3411,7 @@
         <w:pStyle w:val="Compact"/>
         <w:numPr>
           <w:ilvl w:val="1"/>
-          <w:numId w:val="1033"/>
+          <w:numId w:val="1035"/>
         </w:numPr>
       </w:pPr>
       <w:r>
@@ -3514,7 +3703,7 @@
         <w:pStyle w:val="Compact"/>
         <w:numPr>
           <w:ilvl w:val="0"/>
-          <w:numId w:val="1034"/>
+          <w:numId w:val="1036"/>
         </w:numPr>
       </w:pPr>
       <w:r>
@@ -3526,7 +3715,7 @@
         <w:pStyle w:val="Compact"/>
         <w:numPr>
           <w:ilvl w:val="0"/>
-          <w:numId w:val="1034"/>
+          <w:numId w:val="1036"/>
         </w:numPr>
       </w:pPr>
       <w:r>
@@ -3547,7 +3736,7 @@
         <w:pStyle w:val="Compact"/>
         <w:numPr>
           <w:ilvl w:val="0"/>
-          <w:numId w:val="1034"/>
+          <w:numId w:val="1036"/>
         </w:numPr>
       </w:pPr>
       <w:r>
@@ -3926,7 +4115,7 @@
         <w:pStyle w:val="Compact"/>
         <w:numPr>
           <w:ilvl w:val="0"/>
-          <w:numId w:val="1035"/>
+          <w:numId w:val="1037"/>
         </w:numPr>
       </w:pPr>
       <w:r>
@@ -3946,7 +4135,7 @@
         <w:t xml:space="preserve"> </w:t>
       </w:r>
       <w:r>
-        <w:t xml:space="preserve">— that is summer vs winter, repeated 78 times</w:t>
+        <w:t xml:space="preserve">— that is summer vs winter, repeated 69 times</w:t>
       </w:r>
     </w:p>
     <w:p>
@@ -3954,11 +4143,11 @@
         <w:pStyle w:val="Compact"/>
         <w:numPr>
           <w:ilvl w:val="0"/>
-          <w:numId w:val="1035"/>
-        </w:numPr>
-      </w:pPr>
-      <w:r>
-        <w:t xml:space="preserve">~28,000 points on top of each other</w:t>
+          <w:numId w:val="1037"/>
+        </w:numPr>
+      </w:pPr>
+      <w:r>
+        <w:t xml:space="preserve">~25,000 points on top of each other</w:t>
       </w:r>
     </w:p>
     <w:p>
@@ -3966,7 +4155,7 @@
         <w:pStyle w:val="Compact"/>
         <w:numPr>
           <w:ilvl w:val="0"/>
-          <w:numId w:val="1035"/>
+          <w:numId w:val="1037"/>
         </w:numPr>
       </w:pPr>
       <w:r>
@@ -4242,7 +4431,7 @@
         <w:pStyle w:val="Compact"/>
         <w:numPr>
           <w:ilvl w:val="0"/>
-          <w:numId w:val="1036"/>
+          <w:numId w:val="1038"/>
         </w:numPr>
       </w:pPr>
       <w:r>
@@ -4263,7 +4452,7 @@
         <w:pStyle w:val="Compact"/>
         <w:numPr>
           <w:ilvl w:val="0"/>
-          <w:numId w:val="1036"/>
+          <w:numId w:val="1038"/>
         </w:numPr>
       </w:pPr>
       <w:r>
@@ -4284,15 +4473,15 @@
         <w:pStyle w:val="Compact"/>
         <w:numPr>
           <w:ilvl w:val="0"/>
-          <w:numId w:val="1036"/>
-        </w:numPr>
-      </w:pPr>
-      <w:r>
-        <w:rPr>
-          <w:b/>
-          <w:bCs/>
-        </w:rPr>
-        <w:t xml:space="preserve">28,000 rows become 78</w:t>
+          <w:numId w:val="1038"/>
+        </w:numPr>
+      </w:pPr>
+      <w:r>
+        <w:rPr>
+          <w:b/>
+          <w:bCs/>
+        </w:rPr>
+        <w:t xml:space="preserve">25,000 rows become 69</w:t>
       </w:r>
     </w:p>
     <w:p>
@@ -4300,7 +4489,7 @@
         <w:pStyle w:val="Compact"/>
         <w:numPr>
           <w:ilvl w:val="0"/>
-          <w:numId w:val="1036"/>
+          <w:numId w:val="1038"/>
         </w:numPr>
       </w:pPr>
       <w:r>
@@ -4691,7 +4880,7 @@
         <w:pStyle w:val="Compact"/>
         <w:numPr>
           <w:ilvl w:val="0"/>
-          <w:numId w:val="1037"/>
+          <w:numId w:val="1039"/>
         </w:numPr>
       </w:pPr>
       <w:r>
@@ -4713,11 +4902,11 @@
         <w:pStyle w:val="Compact"/>
         <w:numPr>
           <w:ilvl w:val="0"/>
-          <w:numId w:val="1037"/>
-        </w:numPr>
-      </w:pPr>
-      <w:r>
-        <w:t xml:space="preserve">78 points instead of 28,000 — and the story is</w:t>
+          <w:numId w:val="1039"/>
+        </w:numPr>
+      </w:pPr>
+      <w:r>
+        <w:t xml:space="preserve">69 points instead of 25,000 — and the story is</w:t>
       </w:r>
       <w:r>
         <w:t xml:space="preserve"> </w:t>
@@ -4738,7 +4927,7 @@
         <w:pStyle w:val="Compact"/>
         <w:numPr>
           <w:ilvl w:val="0"/>
-          <w:numId w:val="1037"/>
+          <w:numId w:val="1039"/>
         </w:numPr>
       </w:pPr>
       <w:r>
@@ -4750,7 +4939,7 @@
         <w:pStyle w:val="Compact"/>
         <w:numPr>
           <w:ilvl w:val="0"/>
-          <w:numId w:val="1037"/>
+          <w:numId w:val="1039"/>
         </w:numPr>
       </w:pPr>
       <w:r>
@@ -5068,7 +5257,7 @@
         <w:pStyle w:val="Compact"/>
         <w:numPr>
           <w:ilvl w:val="0"/>
-          <w:numId w:val="1038"/>
+          <w:numId w:val="1040"/>
         </w:numPr>
       </w:pPr>
       <w:r>
@@ -5105,7 +5294,7 @@
         <w:pStyle w:val="Compact"/>
         <w:numPr>
           <w:ilvl w:val="0"/>
-          <w:numId w:val="1038"/>
+          <w:numId w:val="1040"/>
         </w:numPr>
       </w:pPr>
       <w:r>
@@ -5117,7 +5306,7 @@
         <w:pStyle w:val="Compact"/>
         <w:numPr>
           <w:ilvl w:val="0"/>
-          <w:numId w:val="1038"/>
+          <w:numId w:val="1040"/>
         </w:numPr>
       </w:pPr>
       <w:r>
@@ -5129,7 +5318,7 @@
         <w:pStyle w:val="Compact"/>
         <w:numPr>
           <w:ilvl w:val="1"/>
-          <w:numId w:val="1039"/>
+          <w:numId w:val="1041"/>
         </w:numPr>
       </w:pPr>
       <w:r>
@@ -5181,7 +5370,7 @@
         <w:pStyle w:val="Compact"/>
         <w:numPr>
           <w:ilvl w:val="1"/>
-          <w:numId w:val="1039"/>
+          <w:numId w:val="1041"/>
         </w:numPr>
       </w:pPr>
       <w:r>
@@ -5242,7 +5431,7 @@
         <w:pStyle w:val="Compact"/>
         <w:numPr>
           <w:ilvl w:val="1"/>
-          <w:numId w:val="1039"/>
+          <w:numId w:val="1041"/>
         </w:numPr>
       </w:pPr>
       <w:r>
@@ -5324,7 +5513,7 @@
         <w:pStyle w:val="Compact"/>
         <w:numPr>
           <w:ilvl w:val="0"/>
-          <w:numId w:val="1040"/>
+          <w:numId w:val="1042"/>
         </w:numPr>
       </w:pPr>
       <w:r>
@@ -5361,7 +5550,7 @@
         <w:pStyle w:val="Compact"/>
         <w:numPr>
           <w:ilvl w:val="1"/>
-          <w:numId w:val="1041"/>
+          <w:numId w:val="1043"/>
         </w:numPr>
       </w:pPr>
       <w:r>
@@ -5383,7 +5572,7 @@
         <w:pStyle w:val="Compact"/>
         <w:numPr>
           <w:ilvl w:val="1"/>
-          <w:numId w:val="1041"/>
+          <w:numId w:val="1043"/>
         </w:numPr>
       </w:pPr>
       <w:r>
@@ -5405,7 +5594,7 @@
         <w:pStyle w:val="Compact"/>
         <w:numPr>
           <w:ilvl w:val="1"/>
-          <w:numId w:val="1041"/>
+          <w:numId w:val="1043"/>
         </w:numPr>
       </w:pPr>
       <w:r>
@@ -5427,11 +5616,11 @@
         <w:pStyle w:val="Compact"/>
         <w:numPr>
           <w:ilvl w:val="1"/>
-          <w:numId w:val="1041"/>
-        </w:numPr>
-      </w:pPr>
-      <w:r>
-        <w:t xml:space="preserve">over ~78 years → roughly</w:t>
+          <w:numId w:val="1043"/>
+        </w:numPr>
+      </w:pPr>
+      <w:r>
+        <w:t xml:space="preserve">over ~77 years → roughly</w:t>
       </w:r>
       <w:r>
         <w:t xml:space="preserve"> </w:t>
@@ -5449,7 +5638,7 @@
         <w:pStyle w:val="Compact"/>
         <w:numPr>
           <w:ilvl w:val="0"/>
-          <w:numId w:val="1040"/>
+          <w:numId w:val="1042"/>
         </w:numPr>
       </w:pPr>
       <w:r>
@@ -5479,62 +5668,6 @@
       </w:r>
       <w:r>
         <w:t xml:space="preserve">(far below 0.001)</w:t>
-      </w:r>
-    </w:p>
-    <w:p>
-      <w:pPr>
-        <w:pStyle w:val="Compact"/>
-        <w:numPr>
-          <w:ilvl w:val="1"/>
-          <w:numId w:val="1042"/>
-        </w:numPr>
-      </w:pPr>
-      <w:r>
-        <w:t xml:space="preserve">the warming is</w:t>
-      </w:r>
-      <w:r>
-        <w:t xml:space="preserve"> </w:t>
-      </w:r>
-      <w:r>
-        <w:rPr>
-          <w:b/>
-          <w:bCs/>
-        </w:rPr>
-        <w:t xml:space="preserve">real</w:t>
-      </w:r>
-      <w:r>
-        <w:t xml:space="preserve">, not year-to-year luck</w:t>
-      </w:r>
-    </w:p>
-    <w:p>
-      <w:pPr>
-        <w:pStyle w:val="Compact"/>
-        <w:numPr>
-          <w:ilvl w:val="0"/>
-          <w:numId w:val="1043"/>
-        </w:numPr>
-      </w:pPr>
-      <w:r>
-        <w:rPr>
-          <w:rStyle w:val="VerbatimChar"/>
-          <w:b/>
-          <w:bCs/>
-        </w:rPr>
-        <w:t xml:space="preserve">Multiple R-squared</w:t>
-      </w:r>
-      <w:r>
-        <w:rPr>
-          <w:b/>
-          <w:bCs/>
-        </w:rPr>
-        <w:t xml:space="preserve"> </w:t>
-      </w:r>
-      <w:r>
-        <w:rPr>
-          <w:b/>
-          <w:bCs/>
-        </w:rPr>
-        <w:t xml:space="preserve">≈ 0.34</w:t>
       </w:r>
     </w:p>
     <w:p>
@@ -5546,6 +5679,62 @@
         </w:numPr>
       </w:pPr>
       <w:r>
+        <w:t xml:space="preserve">the warming is</w:t>
+      </w:r>
+      <w:r>
+        <w:t xml:space="preserve"> </w:t>
+      </w:r>
+      <w:r>
+        <w:rPr>
+          <w:b/>
+          <w:bCs/>
+        </w:rPr>
+        <w:t xml:space="preserve">real</w:t>
+      </w:r>
+      <w:r>
+        <w:t xml:space="preserve">, not year-to-year luck</w:t>
+      </w:r>
+    </w:p>
+    <w:p>
+      <w:pPr>
+        <w:pStyle w:val="Compact"/>
+        <w:numPr>
+          <w:ilvl w:val="0"/>
+          <w:numId w:val="1045"/>
+        </w:numPr>
+      </w:pPr>
+      <w:r>
+        <w:rPr>
+          <w:rStyle w:val="VerbatimChar"/>
+          <w:b/>
+          <w:bCs/>
+        </w:rPr>
+        <w:t xml:space="preserve">Multiple R-squared</w:t>
+      </w:r>
+      <w:r>
+        <w:rPr>
+          <w:b/>
+          <w:bCs/>
+        </w:rPr>
+        <w:t xml:space="preserve"> </w:t>
+      </w:r>
+      <w:r>
+        <w:rPr>
+          <w:b/>
+          <w:bCs/>
+        </w:rPr>
+        <w:t xml:space="preserve">≈ 0.32</w:t>
+      </w:r>
+    </w:p>
+    <w:p>
+      <w:pPr>
+        <w:pStyle w:val="Compact"/>
+        <w:numPr>
+          <w:ilvl w:val="1"/>
+          <w:numId w:val="1046"/>
+        </w:numPr>
+      </w:pPr>
+      <w:r>
         <w:t xml:space="preserve">year explains about</w:t>
       </w:r>
       <w:r>
@@ -5570,7 +5759,7 @@
         <w:pStyle w:val="Compact"/>
         <w:numPr>
           <w:ilvl w:val="1"/>
-          <w:numId w:val="1044"/>
+          <w:numId w:val="1046"/>
         </w:numPr>
       </w:pPr>
       <w:r>
@@ -5598,7 +5787,7 @@
         <w:pStyle w:val="Compact"/>
         <w:numPr>
           <w:ilvl w:val="1"/>
-          <w:numId w:val="1044"/>
+          <w:numId w:val="1046"/>
         </w:numPr>
       </w:pPr>
       <w:r>
@@ -5742,7 +5931,7 @@
               <w:pStyle w:val="Compact"/>
               <w:numPr>
                 <w:ilvl w:val="0"/>
-                <w:numId w:val="1045"/>
+                <w:numId w:val="1047"/>
               </w:numPr>
             </w:pPr>
             <w:r>
@@ -5760,7 +5949,7 @@
               <w:pStyle w:val="Compact"/>
               <w:numPr>
                 <w:ilvl w:val="0"/>
-                <w:numId w:val="1045"/>
+                <w:numId w:val="1047"/>
               </w:numPr>
             </w:pPr>
             <w:r>
@@ -5772,7 +5961,7 @@
               <w:pStyle w:val="Compact"/>
               <w:numPr>
                 <w:ilvl w:val="0"/>
-                <w:numId w:val="1045"/>
+                <w:numId w:val="1047"/>
               </w:numPr>
             </w:pPr>
             <w:r>
@@ -5826,7 +6015,7 @@
         <w:pStyle w:val="Compact"/>
         <w:numPr>
           <w:ilvl w:val="0"/>
-          <w:numId w:val="1046"/>
+          <w:numId w:val="1048"/>
         </w:numPr>
       </w:pPr>
       <w:r>
@@ -5853,7 +6042,7 @@
         <w:pStyle w:val="Compact"/>
         <w:numPr>
           <w:ilvl w:val="0"/>
-          <w:numId w:val="1046"/>
+          <w:numId w:val="1048"/>
         </w:numPr>
       </w:pPr>
       <w:r>
@@ -5865,7 +6054,7 @@
         <w:pStyle w:val="Compact"/>
         <w:numPr>
           <w:ilvl w:val="0"/>
-          <w:numId w:val="1046"/>
+          <w:numId w:val="1048"/>
         </w:numPr>
       </w:pPr>
       <w:r>
@@ -5877,7 +6066,7 @@
         <w:pStyle w:val="Compact"/>
         <w:numPr>
           <w:ilvl w:val="0"/>
-          <w:numId w:val="1046"/>
+          <w:numId w:val="1048"/>
         </w:numPr>
       </w:pPr>
       <w:r>
@@ -5982,7 +6171,7 @@
         <w:pStyle w:val="Compact"/>
         <w:numPr>
           <w:ilvl w:val="0"/>
-          <w:numId w:val="1047"/>
+          <w:numId w:val="1049"/>
         </w:numPr>
       </w:pPr>
       <w:r>
@@ -6004,7 +6193,7 @@
         <w:pStyle w:val="Compact"/>
         <w:numPr>
           <w:ilvl w:val="0"/>
-          <w:numId w:val="1047"/>
+          <w:numId w:val="1049"/>
         </w:numPr>
       </w:pPr>
       <w:r>
@@ -6026,7 +6215,7 @@
         <w:pStyle w:val="Compact"/>
         <w:numPr>
           <w:ilvl w:val="0"/>
-          <w:numId w:val="1047"/>
+          <w:numId w:val="1049"/>
         </w:numPr>
       </w:pPr>
       <w:r>
@@ -6038,7 +6227,7 @@
         <w:pStyle w:val="Compact"/>
         <w:numPr>
           <w:ilvl w:val="1"/>
-          <w:numId w:val="1048"/>
+          <w:numId w:val="1050"/>
         </w:numPr>
       </w:pPr>
       <w:r>
@@ -6086,7 +6275,7 @@
         <w:pStyle w:val="Compact"/>
         <w:numPr>
           <w:ilvl w:val="1"/>
-          <w:numId w:val="1048"/>
+          <w:numId w:val="1050"/>
         </w:numPr>
       </w:pPr>
       <w:r>
@@ -6134,7 +6323,7 @@
         <w:pStyle w:val="Compact"/>
         <w:numPr>
           <w:ilvl w:val="1"/>
-          <w:numId w:val="1048"/>
+          <w:numId w:val="1050"/>
         </w:numPr>
       </w:pPr>
       <w:r>
@@ -6168,7 +6357,7 @@
         <w:pStyle w:val="Compact"/>
         <w:numPr>
           <w:ilvl w:val="0"/>
-          <w:numId w:val="1049"/>
+          <w:numId w:val="1051"/>
         </w:numPr>
       </w:pPr>
       <w:r>
@@ -6204,7 +6393,7 @@
         <w:pStyle w:val="Compact"/>
         <w:numPr>
           <w:ilvl w:val="0"/>
-          <w:numId w:val="1049"/>
+          <w:numId w:val="1051"/>
         </w:numPr>
       </w:pPr>
       <w:r>
@@ -6234,7 +6423,7 @@
         <w:pStyle w:val="Compact"/>
         <w:numPr>
           <w:ilvl w:val="0"/>
-          <w:numId w:val="1049"/>
+          <w:numId w:val="1051"/>
         </w:numPr>
       </w:pPr>
       <w:r>
@@ -6377,7 +6566,7 @@
               <w:pStyle w:val="Compact"/>
               <w:numPr>
                 <w:ilvl w:val="0"/>
-                <w:numId w:val="1050"/>
+                <w:numId w:val="1052"/>
               </w:numPr>
             </w:pPr>
             <w:r>
@@ -6405,7 +6594,7 @@
               <w:pStyle w:val="Compact"/>
               <w:numPr>
                 <w:ilvl w:val="0"/>
-                <w:numId w:val="1050"/>
+                <w:numId w:val="1052"/>
               </w:numPr>
             </w:pPr>
             <w:r>
@@ -6433,7 +6622,7 @@
               <w:pStyle w:val="Compact"/>
               <w:numPr>
                 <w:ilvl w:val="0"/>
-                <w:numId w:val="1050"/>
+                <w:numId w:val="1052"/>
               </w:numPr>
             </w:pPr>
             <w:r>
@@ -6459,7 +6648,7 @@
         <w:pStyle w:val="Compact"/>
         <w:numPr>
           <w:ilvl w:val="0"/>
-          <w:numId w:val="1051"/>
+          <w:numId w:val="1053"/>
         </w:numPr>
       </w:pPr>
       <w:r>
@@ -6486,7 +6675,7 @@
         <w:pStyle w:val="Compact"/>
         <w:numPr>
           <w:ilvl w:val="1"/>
-          <w:numId w:val="1052"/>
+          <w:numId w:val="1054"/>
         </w:numPr>
       </w:pPr>
       <w:r>
@@ -6498,7 +6687,7 @@
         <w:pStyle w:val="Compact"/>
         <w:numPr>
           <w:ilvl w:val="1"/>
-          <w:numId w:val="1052"/>
+          <w:numId w:val="1054"/>
         </w:numPr>
       </w:pPr>
       <w:r>
@@ -6938,7 +7127,7 @@
         <w:pStyle w:val="Compact"/>
         <w:numPr>
           <w:ilvl w:val="0"/>
-          <w:numId w:val="1053"/>
+          <w:numId w:val="1055"/>
         </w:numPr>
       </w:pPr>
       <w:r>
@@ -6988,7 +7177,7 @@
         <w:pStyle w:val="Compact"/>
         <w:numPr>
           <w:ilvl w:val="1"/>
-          <w:numId w:val="1054"/>
+          <w:numId w:val="1056"/>
         </w:numPr>
       </w:pPr>
       <w:r>
@@ -7016,7 +7205,7 @@
         <w:pStyle w:val="Compact"/>
         <w:numPr>
           <w:ilvl w:val="0"/>
-          <w:numId w:val="1053"/>
+          <w:numId w:val="1055"/>
         </w:numPr>
       </w:pPr>
       <w:r>
@@ -7043,7 +7232,7 @@
         <w:pStyle w:val="Compact"/>
         <w:numPr>
           <w:ilvl w:val="0"/>
-          <w:numId w:val="1053"/>
+          <w:numId w:val="1055"/>
         </w:numPr>
       </w:pPr>
       <w:r>
@@ -7064,7 +7253,7 @@
         <w:pStyle w:val="Compact"/>
         <w:numPr>
           <w:ilvl w:val="0"/>
-          <w:numId w:val="1053"/>
+          <w:numId w:val="1055"/>
         </w:numPr>
       </w:pPr>
       <w:r>
@@ -7441,7 +7630,7 @@
         <w:pStyle w:val="Compact"/>
         <w:numPr>
           <w:ilvl w:val="0"/>
-          <w:numId w:val="1055"/>
+          <w:numId w:val="1057"/>
         </w:numPr>
       </w:pPr>
       <w:r>
@@ -7483,7 +7672,7 @@
         <w:pStyle w:val="Compact"/>
         <w:numPr>
           <w:ilvl w:val="1"/>
-          <w:numId w:val="1056"/>
+          <w:numId w:val="1058"/>
         </w:numPr>
       </w:pPr>
       <w:r>
@@ -7495,7 +7684,7 @@
         <w:pStyle w:val="Compact"/>
         <w:numPr>
           <w:ilvl w:val="0"/>
-          <w:numId w:val="1055"/>
+          <w:numId w:val="1057"/>
         </w:numPr>
       </w:pPr>
       <w:r>
@@ -7532,41 +7721,41 @@
         <w:pStyle w:val="Compact"/>
         <w:numPr>
           <w:ilvl w:val="1"/>
+          <w:numId w:val="1059"/>
+        </w:numPr>
+      </w:pPr>
+      <w:r>
+        <w:t xml:space="preserve">one row per year</w:t>
+      </w:r>
+      <w:r>
+        <w:t xml:space="preserve"> </w:t>
+      </w:r>
+      <w:r>
+        <w:rPr>
+          <w:b/>
+          <w:bCs/>
+        </w:rPr>
+        <w:t xml:space="preserve">per season</w:t>
+      </w:r>
+    </w:p>
+    <w:p>
+      <w:pPr>
+        <w:pStyle w:val="Compact"/>
+        <w:numPr>
+          <w:ilvl w:val="1"/>
+          <w:numId w:val="1059"/>
+        </w:numPr>
+      </w:pPr>
+      <w:r>
+        <w:t xml:space="preserve">69 years × 2 seasons = 138 rows</w:t>
+      </w:r>
+    </w:p>
+    <w:p>
+      <w:pPr>
+        <w:pStyle w:val="Compact"/>
+        <w:numPr>
+          <w:ilvl w:val="0"/>
           <w:numId w:val="1057"/>
-        </w:numPr>
-      </w:pPr>
-      <w:r>
-        <w:t xml:space="preserve">one row per year</w:t>
-      </w:r>
-      <w:r>
-        <w:t xml:space="preserve"> </w:t>
-      </w:r>
-      <w:r>
-        <w:rPr>
-          <w:b/>
-          <w:bCs/>
-        </w:rPr>
-        <w:t xml:space="preserve">per season</w:t>
-      </w:r>
-    </w:p>
-    <w:p>
-      <w:pPr>
-        <w:pStyle w:val="Compact"/>
-        <w:numPr>
-          <w:ilvl w:val="1"/>
-          <w:numId w:val="1057"/>
-        </w:numPr>
-      </w:pPr>
-      <w:r>
-        <w:t xml:space="preserve">78 years × 2 seasons ≈ 156 rows</w:t>
-      </w:r>
-    </w:p>
-    <w:p>
-      <w:pPr>
-        <w:pStyle w:val="Compact"/>
-        <w:numPr>
-          <w:ilvl w:val="0"/>
-          <w:numId w:val="1055"/>
         </w:numPr>
       </w:pPr>
       <w:r>
@@ -7861,7 +8050,7 @@
         <w:pStyle w:val="Compact"/>
         <w:numPr>
           <w:ilvl w:val="0"/>
-          <w:numId w:val="1058"/>
+          <w:numId w:val="1060"/>
         </w:numPr>
       </w:pPr>
       <w:r>
@@ -7897,7 +8086,7 @@
         <w:pStyle w:val="Compact"/>
         <w:numPr>
           <w:ilvl w:val="1"/>
-          <w:numId w:val="1059"/>
+          <w:numId w:val="1061"/>
         </w:numPr>
       </w:pPr>
       <w:r>
@@ -7909,7 +8098,7 @@
         <w:pStyle w:val="Compact"/>
         <w:numPr>
           <w:ilvl w:val="1"/>
-          <w:numId w:val="1059"/>
+          <w:numId w:val="1061"/>
         </w:numPr>
       </w:pPr>
       <w:r>
@@ -7946,7 +8135,7 @@
         <w:pStyle w:val="Compact"/>
         <w:numPr>
           <w:ilvl w:val="0"/>
-          <w:numId w:val="1058"/>
+          <w:numId w:val="1060"/>
         </w:numPr>
       </w:pPr>
       <w:r>
@@ -7958,7 +8147,7 @@
         <w:pStyle w:val="Compact"/>
         <w:numPr>
           <w:ilvl w:val="0"/>
-          <w:numId w:val="1058"/>
+          <w:numId w:val="1060"/>
         </w:numPr>
       </w:pPr>
       <w:r>
@@ -7974,53 +8163,53 @@
         <w:pStyle w:val="Compact"/>
         <w:numPr>
           <w:ilvl w:val="1"/>
+          <w:numId w:val="1062"/>
+        </w:numPr>
+      </w:pPr>
+      <w:r>
+        <w:t xml:space="preserve">the height is just</w:t>
+      </w:r>
+      <w:r>
+        <w:t xml:space="preserve"> </w:t>
+      </w:r>
+      <w:r>
+        <w:t xml:space="preserve">“winter is cold”</w:t>
+      </w:r>
+    </w:p>
+    <w:p>
+      <w:pPr>
+        <w:pStyle w:val="Compact"/>
+        <w:numPr>
+          <w:ilvl w:val="1"/>
+          <w:numId w:val="1062"/>
+        </w:numPr>
+      </w:pPr>
+      <w:r>
+        <w:t xml:space="preserve">the</w:t>
+      </w:r>
+      <w:r>
+        <w:t xml:space="preserve"> </w:t>
+      </w:r>
+      <w:r>
+        <w:rPr>
+          <w:b/>
+          <w:bCs/>
+        </w:rPr>
+        <w:t xml:space="preserve">slope</w:t>
+      </w:r>
+      <w:r>
+        <w:t xml:space="preserve"> </w:t>
+      </w:r>
+      <w:r>
+        <w:t xml:space="preserve">is the warming rate</w:t>
+      </w:r>
+    </w:p>
+    <w:p>
+      <w:pPr>
+        <w:pStyle w:val="Compact"/>
+        <w:numPr>
+          <w:ilvl w:val="0"/>
           <w:numId w:val="1060"/>
-        </w:numPr>
-      </w:pPr>
-      <w:r>
-        <w:t xml:space="preserve">the height is just</w:t>
-      </w:r>
-      <w:r>
-        <w:t xml:space="preserve"> </w:t>
-      </w:r>
-      <w:r>
-        <w:t xml:space="preserve">“winter is cold”</w:t>
-      </w:r>
-    </w:p>
-    <w:p>
-      <w:pPr>
-        <w:pStyle w:val="Compact"/>
-        <w:numPr>
-          <w:ilvl w:val="1"/>
-          <w:numId w:val="1060"/>
-        </w:numPr>
-      </w:pPr>
-      <w:r>
-        <w:t xml:space="preserve">the</w:t>
-      </w:r>
-      <w:r>
-        <w:t xml:space="preserve"> </w:t>
-      </w:r>
-      <w:r>
-        <w:rPr>
-          <w:b/>
-          <w:bCs/>
-        </w:rPr>
-        <w:t xml:space="preserve">slope</w:t>
-      </w:r>
-      <w:r>
-        <w:t xml:space="preserve"> </w:t>
-      </w:r>
-      <w:r>
-        <w:t xml:space="preserve">is the warming rate</w:t>
-      </w:r>
-    </w:p>
-    <w:p>
-      <w:pPr>
-        <w:pStyle w:val="Compact"/>
-        <w:numPr>
-          <w:ilvl w:val="0"/>
-          <w:numId w:val="1058"/>
         </w:numPr>
       </w:pPr>
       <w:r>
@@ -8340,7 +8529,7 @@
         <w:pStyle w:val="Compact"/>
         <w:numPr>
           <w:ilvl w:val="0"/>
-          <w:numId w:val="1061"/>
+          <w:numId w:val="1063"/>
         </w:numPr>
       </w:pPr>
       <w:r>
@@ -8400,7 +8589,7 @@
         <w:pStyle w:val="Compact"/>
         <w:numPr>
           <w:ilvl w:val="0"/>
-          <w:numId w:val="1061"/>
+          <w:numId w:val="1063"/>
         </w:numPr>
       </w:pPr>
       <w:r>
@@ -8416,7 +8605,7 @@
           <w:b/>
           <w:bCs/>
         </w:rPr>
-        <w:t xml:space="preserve">Summer slope ≈ 0.021 °C/year</w:t>
+        <w:t xml:space="preserve">Summer slope ≈ 0.022 °C/year</w:t>
       </w:r>
     </w:p>
     <w:p>
@@ -8424,7 +8613,7 @@
         <w:pStyle w:val="Compact"/>
         <w:numPr>
           <w:ilvl w:val="0"/>
-          <w:numId w:val="1062"/>
+          <w:numId w:val="1064"/>
         </w:numPr>
       </w:pPr>
       <w:r>
@@ -8438,7 +8627,7 @@
           <w:b/>
           <w:bCs/>
         </w:rPr>
-        <w:t xml:space="preserve">0.21 °C per decade</w:t>
+        <w:t xml:space="preserve">0.22 °C per decade</w:t>
       </w:r>
     </w:p>
     <w:p>
@@ -8446,7 +8635,7 @@
         <w:pStyle w:val="Compact"/>
         <w:numPr>
           <w:ilvl w:val="0"/>
-          <w:numId w:val="1062"/>
+          <w:numId w:val="1064"/>
         </w:numPr>
       </w:pPr>
       <w:r>
@@ -8788,7 +8977,7 @@
           <w:b/>
           <w:bCs/>
         </w:rPr>
-        <w:t xml:space="preserve">Winter slope ≈ 0.034 °C/year</w:t>
+        <w:t xml:space="preserve">Winter slope ≈ 0.037 °C/year</w:t>
       </w:r>
     </w:p>
     <w:p>
@@ -8796,7 +8985,7 @@
         <w:pStyle w:val="Compact"/>
         <w:numPr>
           <w:ilvl w:val="0"/>
-          <w:numId w:val="1063"/>
+          <w:numId w:val="1065"/>
         </w:numPr>
       </w:pPr>
       <w:r>
@@ -8810,7 +8999,7 @@
           <w:b/>
           <w:bCs/>
         </w:rPr>
-        <w:t xml:space="preserve">0.34 °C per decade</w:t>
+        <w:t xml:space="preserve">0.37 °C per decade</w:t>
       </w:r>
     </w:p>
     <w:p>
@@ -8818,7 +9007,7 @@
         <w:pStyle w:val="Compact"/>
         <w:numPr>
           <w:ilvl w:val="0"/>
-          <w:numId w:val="1063"/>
+          <w:numId w:val="1065"/>
         </w:numPr>
       </w:pPr>
       <w:r>
@@ -8832,7 +9021,7 @@
         <w:t xml:space="preserve"> </w:t>
       </w:r>
       <w:r>
-        <w:t xml:space="preserve">= 0.001 → real</w:t>
+        <w:t xml:space="preserve">= 0.0006 → real</w:t>
       </w:r>
     </w:p>
     <w:p>
@@ -8844,7 +9033,7 @@
           <w:b/>
           <w:bCs/>
         </w:rPr>
-        <w:t xml:space="preserve">Winter is warming about 1.6× as fast as summer.</w:t>
+        <w:t xml:space="preserve">Winter is warming about 1.7× as fast as summer.</w:t>
       </w:r>
     </w:p>
     <w:p>
@@ -8852,7 +9041,7 @@
         <w:pStyle w:val="Compact"/>
         <w:numPr>
           <w:ilvl w:val="0"/>
-          <w:numId w:val="1064"/>
+          <w:numId w:val="1066"/>
         </w:numPr>
       </w:pPr>
       <w:r>
@@ -8864,7 +9053,7 @@
         <w:pStyle w:val="Compact"/>
         <w:numPr>
           <w:ilvl w:val="0"/>
-          <w:numId w:val="1064"/>
+          <w:numId w:val="1066"/>
         </w:numPr>
       </w:pPr>
       <w:r>
@@ -8876,7 +9065,7 @@
         <w:pStyle w:val="Compact"/>
         <w:numPr>
           <w:ilvl w:val="0"/>
-          <w:numId w:val="1064"/>
+          <w:numId w:val="1066"/>
         </w:numPr>
       </w:pPr>
       <w:r>
@@ -9035,7 +9224,7 @@
               <w:pStyle w:val="Compact"/>
             </w:pPr>
             <w:r>
-              <w:t xml:space="preserve">&lt;0.001</w:t>
+              <w:t xml:space="preserve">0.0000003</w:t>
             </w:r>
           </w:p>
         </w:tc>
@@ -9059,7 +9248,7 @@
               <w:pStyle w:val="Compact"/>
             </w:pPr>
             <w:r>
-              <w:t xml:space="preserve">0.021</w:t>
+              <w:t xml:space="preserve">0.022</w:t>
             </w:r>
           </w:p>
         </w:tc>
@@ -9070,7 +9259,7 @@
               <w:pStyle w:val="Compact"/>
             </w:pPr>
             <w:r>
-              <w:t xml:space="preserve">0.21</w:t>
+              <w:t xml:space="preserve">0.22</w:t>
             </w:r>
           </w:p>
         </w:tc>
@@ -9081,7 +9270,7 @@
               <w:pStyle w:val="Compact"/>
             </w:pPr>
             <w:r>
-              <w:t xml:space="preserve">&lt;0.001</w:t>
+              <w:t xml:space="preserve">0.0002</w:t>
             </w:r>
           </w:p>
         </w:tc>
@@ -9105,7 +9294,7 @@
               <w:pStyle w:val="Compact"/>
             </w:pPr>
             <w:r>
-              <w:t xml:space="preserve">0.034</w:t>
+              <w:t xml:space="preserve">0.037</w:t>
             </w:r>
           </w:p>
         </w:tc>
@@ -9116,7 +9305,7 @@
               <w:pStyle w:val="Compact"/>
             </w:pPr>
             <w:r>
-              <w:t xml:space="preserve">0.34</w:t>
+              <w:t xml:space="preserve">0.37</w:t>
             </w:r>
           </w:p>
         </w:tc>
@@ -9127,7 +9316,7 @@
               <w:pStyle w:val="Compact"/>
             </w:pPr>
             <w:r>
-              <w:t xml:space="preserve">0.001</w:t>
+              <w:t xml:space="preserve">0.0006</w:t>
             </w:r>
           </w:p>
         </w:tc>
@@ -9138,7 +9327,7 @@
         <w:pStyle w:val="Compact"/>
         <w:numPr>
           <w:ilvl w:val="0"/>
-          <w:numId w:val="1065"/>
+          <w:numId w:val="1067"/>
         </w:numPr>
       </w:pPr>
       <w:r>
@@ -9166,7 +9355,7 @@
         <w:pStyle w:val="Compact"/>
         <w:numPr>
           <w:ilvl w:val="0"/>
-          <w:numId w:val="1065"/>
+          <w:numId w:val="1067"/>
         </w:numPr>
       </w:pPr>
       <w:r>
@@ -9210,7 +9399,7 @@
           <w:i/>
           <w:iCs/>
         </w:rPr>
-        <w:t xml:space="preserve">Mean annual temperature at Duluth rose significantly from 1948 to 2025 (linear regression: slope = 0.027 °C yr⁻¹, equivalent to 0.27 °C per decade; F(1, 68) = 34.3, p &lt; 0.001, R² = 0.34). Winter warmed roughly 1.6 times faster than summer (0.34 vs 0.21 °C per decade).</w:t>
+        <w:t xml:space="preserve">Mean annual temperature at Duluth rose significantly from 1948 to 2024 (linear regression: slope = 0.027 °C yr⁻¹, equivalent to 0.27 °C per decade; F(1, 67) = 32.1, p &lt; 0.001, R² = 0.32). Winter warmed roughly 1.7 times faster than summer (0.37 vs 0.22 °C per decade).</w:t>
       </w:r>
     </w:p>
     <w:p>
@@ -9218,7 +9407,7 @@
         <w:pStyle w:val="Compact"/>
         <w:numPr>
           <w:ilvl w:val="0"/>
-          <w:numId w:val="1066"/>
+          <w:numId w:val="1068"/>
         </w:numPr>
       </w:pPr>
       <w:r>
@@ -9240,7 +9429,7 @@
         <w:pStyle w:val="Compact"/>
         <w:numPr>
           <w:ilvl w:val="0"/>
-          <w:numId w:val="1066"/>
+          <w:numId w:val="1068"/>
         </w:numPr>
       </w:pPr>
       <w:r>
@@ -9268,7 +9457,7 @@
         <w:pStyle w:val="Compact"/>
         <w:numPr>
           <w:ilvl w:val="0"/>
-          <w:numId w:val="1066"/>
+          <w:numId w:val="1068"/>
         </w:numPr>
       </w:pPr>
       <w:r>
@@ -9292,7 +9481,7 @@
       </w:r>
     </w:p>
     <w:bookmarkEnd w:id="63"/>
-    <w:bookmarkStart w:id="66" w:name="now-do-it-for-your-city"/>
+    <w:bookmarkStart w:id="64" w:name="now-do-it-for-your-city"/>
     <w:p>
       <w:pPr>
         <w:pStyle w:val="Heading1"/>
@@ -9309,25 +9498,601 @@
         <w:rPr>
           <w:rStyle w:val="CommentTok"/>
         </w:rPr>
-        <w:t xml:space="preserve"># Find stations near a place you care about ------------</w:t>
-      </w:r>
-      <w:r>
-        <w:br/>
-      </w:r>
+        <w:t xml:space="preserve"># NASA POWER - lon and lat, no station -----------------</w:t>
+      </w:r>
+      <w:r>
+        <w:br/>
+      </w:r>
+      <w:r>
+        <w:rPr>
+          <w:rStyle w:val="NormalTok"/>
+        </w:rPr>
+        <w:t xml:space="preserve">city_df </w:t>
+      </w:r>
+      <w:r>
+        <w:rPr>
+          <w:rStyle w:val="OtherTok"/>
+        </w:rPr>
+        <w:t xml:space="preserve">&lt;-</w:t>
+      </w:r>
+      <w:r>
+        <w:rPr>
+          <w:rStyle w:val="NormalTok"/>
+        </w:rPr>
+        <w:t xml:space="preserve"> </w:t>
+      </w:r>
+      <w:r>
+        <w:rPr>
+          <w:rStyle w:val="FunctionTok"/>
+        </w:rPr>
+        <w:t xml:space="preserve">get_power</w:t>
+      </w:r>
+      <w:r>
+        <w:rPr>
+          <w:rStyle w:val="NormalTok"/>
+        </w:rPr>
+        <w:t xml:space="preserve">(</w:t>
+      </w:r>
+      <w:r>
+        <w:rPr>
+          <w:rStyle w:val="AttributeTok"/>
+        </w:rPr>
+        <w:t xml:space="preserve">community =</w:t>
+      </w:r>
+      <w:r>
+        <w:rPr>
+          <w:rStyle w:val="NormalTok"/>
+        </w:rPr>
+        <w:t xml:space="preserve"> </w:t>
+      </w:r>
+      <w:r>
+        <w:rPr>
+          <w:rStyle w:val="StringTok"/>
+        </w:rPr>
+        <w:t xml:space="preserve">"ag"</w:t>
+      </w:r>
+      <w:r>
+        <w:rPr>
+          <w:rStyle w:val="NormalTok"/>
+        </w:rPr>
+        <w:t xml:space="preserve">,</w:t>
+      </w:r>
+      <w:r>
+        <w:br/>
+      </w:r>
+      <w:r>
+        <w:rPr>
+          <w:rStyle w:val="NormalTok"/>
+        </w:rPr>
+        <w:t xml:space="preserve">                     </w:t>
+      </w:r>
+      <w:r>
+        <w:rPr>
+          <w:rStyle w:val="AttributeTok"/>
+        </w:rPr>
+        <w:t xml:space="preserve">lonlat =</w:t>
+      </w:r>
+      <w:r>
+        <w:rPr>
+          <w:rStyle w:val="NormalTok"/>
+        </w:rPr>
+        <w:t xml:space="preserve"> </w:t>
+      </w:r>
+      <w:r>
+        <w:rPr>
+          <w:rStyle w:val="FunctionTok"/>
+        </w:rPr>
+        <w:t xml:space="preserve">c</w:t>
+      </w:r>
+      <w:r>
+        <w:rPr>
+          <w:rStyle w:val="NormalTok"/>
+        </w:rPr>
+        <w:t xml:space="preserve">(</w:t>
+      </w:r>
+      <w:r>
+        <w:rPr>
+          <w:rStyle w:val="SpecialCharTok"/>
+        </w:rPr>
+        <w:t xml:space="preserve">-</w:t>
+      </w:r>
+      <w:r>
+        <w:rPr>
+          <w:rStyle w:val="FloatTok"/>
+        </w:rPr>
+        <w:t xml:space="preserve">0.13</w:t>
+      </w:r>
+      <w:r>
+        <w:rPr>
+          <w:rStyle w:val="NormalTok"/>
+        </w:rPr>
+        <w:t xml:space="preserve">, </w:t>
+      </w:r>
+      <w:r>
+        <w:rPr>
+          <w:rStyle w:val="FloatTok"/>
+        </w:rPr>
+        <w:t xml:space="preserve">51.51</w:t>
+      </w:r>
+      <w:r>
+        <w:rPr>
+          <w:rStyle w:val="NormalTok"/>
+        </w:rPr>
+        <w:t xml:space="preserve">),</w:t>
+      </w:r>
+      <w:r>
+        <w:br/>
+      </w:r>
+      <w:r>
+        <w:rPr>
+          <w:rStyle w:val="NormalTok"/>
+        </w:rPr>
+        <w:t xml:space="preserve">                     </w:t>
+      </w:r>
+      <w:r>
+        <w:rPr>
+          <w:rStyle w:val="AttributeTok"/>
+        </w:rPr>
+        <w:t xml:space="preserve">pars =</w:t>
+      </w:r>
+      <w:r>
+        <w:rPr>
+          <w:rStyle w:val="NormalTok"/>
+        </w:rPr>
+        <w:t xml:space="preserve"> </w:t>
+      </w:r>
+      <w:r>
+        <w:rPr>
+          <w:rStyle w:val="StringTok"/>
+        </w:rPr>
+        <w:t xml:space="preserve">"T2M"</w:t>
+      </w:r>
+      <w:r>
+        <w:rPr>
+          <w:rStyle w:val="NormalTok"/>
+        </w:rPr>
+        <w:t xml:space="preserve">,</w:t>
+      </w:r>
+      <w:r>
+        <w:br/>
+      </w:r>
+      <w:r>
+        <w:rPr>
+          <w:rStyle w:val="NormalTok"/>
+        </w:rPr>
+        <w:t xml:space="preserve">                     </w:t>
+      </w:r>
+      <w:r>
+        <w:rPr>
+          <w:rStyle w:val="AttributeTok"/>
+        </w:rPr>
+        <w:t xml:space="preserve">dates =</w:t>
+      </w:r>
+      <w:r>
+        <w:rPr>
+          <w:rStyle w:val="NormalTok"/>
+        </w:rPr>
+        <w:t xml:space="preserve"> </w:t>
+      </w:r>
+      <w:r>
+        <w:rPr>
+          <w:rStyle w:val="FunctionTok"/>
+        </w:rPr>
+        <w:t xml:space="preserve">c</w:t>
+      </w:r>
+      <w:r>
+        <w:rPr>
+          <w:rStyle w:val="NormalTok"/>
+        </w:rPr>
+        <w:t xml:space="preserve">(</w:t>
+      </w:r>
+      <w:r>
+        <w:rPr>
+          <w:rStyle w:val="StringTok"/>
+        </w:rPr>
+        <w:t xml:space="preserve">"1981-01-01"</w:t>
+      </w:r>
+      <w:r>
+        <w:rPr>
+          <w:rStyle w:val="NormalTok"/>
+        </w:rPr>
+        <w:t xml:space="preserve">,</w:t>
+      </w:r>
+      <w:r>
+        <w:br/>
+      </w:r>
+      <w:r>
+        <w:rPr>
+          <w:rStyle w:val="NormalTok"/>
+        </w:rPr>
+        <w:t xml:space="preserve">                               </w:t>
+      </w:r>
+      <w:r>
+        <w:rPr>
+          <w:rStyle w:val="StringTok"/>
+        </w:rPr>
+        <w:t xml:space="preserve">"2024-12-31"</w:t>
+      </w:r>
+      <w:r>
+        <w:rPr>
+          <w:rStyle w:val="NormalTok"/>
+        </w:rPr>
+        <w:t xml:space="preserve">),</w:t>
+      </w:r>
+      <w:r>
+        <w:br/>
+      </w:r>
+      <w:r>
+        <w:rPr>
+          <w:rStyle w:val="NormalTok"/>
+        </w:rPr>
+        <w:t xml:space="preserve">                     </w:t>
+      </w:r>
+      <w:r>
+        <w:rPr>
+          <w:rStyle w:val="AttributeTok"/>
+        </w:rPr>
+        <w:t xml:space="preserve">temporal_api =</w:t>
+      </w:r>
+      <w:r>
+        <w:rPr>
+          <w:rStyle w:val="NormalTok"/>
+        </w:rPr>
+        <w:t xml:space="preserve"> </w:t>
+      </w:r>
+      <w:r>
+        <w:rPr>
+          <w:rStyle w:val="StringTok"/>
+        </w:rPr>
+        <w:t xml:space="preserve">"daily"</w:t>
+      </w:r>
+      <w:r>
+        <w:rPr>
+          <w:rStyle w:val="NormalTok"/>
+        </w:rPr>
+        <w:t xml:space="preserve">) </w:t>
+      </w:r>
+      <w:r>
+        <w:rPr>
+          <w:rStyle w:val="SpecialCharTok"/>
+        </w:rPr>
+        <w:t xml:space="preserve">%&gt;%</w:t>
+      </w:r>
+      <w:r>
+        <w:br/>
+      </w:r>
+      <w:r>
+        <w:rPr>
+          <w:rStyle w:val="NormalTok"/>
+        </w:rPr>
+        <w:t xml:space="preserve">  </w:t>
+      </w:r>
+      <w:r>
+        <w:rPr>
+          <w:rStyle w:val="FunctionTok"/>
+        </w:rPr>
+        <w:t xml:space="preserve">clean_names</w:t>
+      </w:r>
+      <w:r>
+        <w:rPr>
+          <w:rStyle w:val="NormalTok"/>
+        </w:rPr>
+        <w:t xml:space="preserve">() </w:t>
+      </w:r>
+      <w:r>
+        <w:rPr>
+          <w:rStyle w:val="SpecialCharTok"/>
+        </w:rPr>
+        <w:t xml:space="preserve">%&gt;%</w:t>
+      </w:r>
+      <w:r>
+        <w:br/>
+      </w:r>
+      <w:r>
+        <w:rPr>
+          <w:rStyle w:val="NormalTok"/>
+        </w:rPr>
+        <w:t xml:space="preserve">  </w:t>
+      </w:r>
+      <w:r>
+        <w:rPr>
+          <w:rStyle w:val="FunctionTok"/>
+        </w:rPr>
+        <w:t xml:space="preserve">rename</w:t>
+      </w:r>
+      <w:r>
+        <w:rPr>
+          <w:rStyle w:val="NormalTok"/>
+        </w:rPr>
+        <w:t xml:space="preserve">(</w:t>
+      </w:r>
+      <w:r>
+        <w:rPr>
+          <w:rStyle w:val="AttributeTok"/>
+        </w:rPr>
+        <w:t xml:space="preserve">month =</w:t>
+      </w:r>
+      <w:r>
+        <w:rPr>
+          <w:rStyle w:val="NormalTok"/>
+        </w:rPr>
+        <w:t xml:space="preserve"> mm, </w:t>
+      </w:r>
+      <w:r>
+        <w:rPr>
+          <w:rStyle w:val="AttributeTok"/>
+        </w:rPr>
+        <w:t xml:space="preserve">temp =</w:t>
+      </w:r>
+      <w:r>
+        <w:rPr>
+          <w:rStyle w:val="NormalTok"/>
+        </w:rPr>
+        <w:t xml:space="preserve"> t2m)</w:t>
+      </w:r>
+      <w:r>
+        <w:br/>
+      </w:r>
+      <w:r>
+        <w:br/>
+      </w:r>
+      <w:r>
+        <w:rPr>
+          <w:rStyle w:val="FunctionTok"/>
+        </w:rPr>
+        <w:t xml:space="preserve">dim</w:t>
+      </w:r>
+      <w:r>
+        <w:rPr>
+          <w:rStyle w:val="NormalTok"/>
+        </w:rPr>
+        <w:t xml:space="preserve">(city_df)</w:t>
+      </w:r>
+    </w:p>
+    <w:p>
+      <w:pPr>
+        <w:pStyle w:val="SourceCode"/>
+      </w:pPr>
+      <w:r>
+        <w:rPr>
+          <w:rStyle w:val="VerbatimChar"/>
+        </w:rPr>
+        <w:t xml:space="preserve">[1] 16071     8</w:t>
+      </w:r>
+    </w:p>
+    <w:p>
+      <w:pPr>
+        <w:pStyle w:val="Compact"/>
+        <w:numPr>
+          <w:ilvl w:val="0"/>
+          <w:numId w:val="1069"/>
+        </w:numPr>
+      </w:pPr>
+      <w:r>
+        <w:rPr>
+          <w:b/>
+          <w:bCs/>
+        </w:rPr>
+        <w:t xml:space="preserve">Why switch packages?</w:t>
+      </w:r>
+    </w:p>
+    <w:p>
+      <w:pPr>
+        <w:pStyle w:val="Compact"/>
+        <w:numPr>
+          <w:ilvl w:val="1"/>
+          <w:numId w:val="1070"/>
+        </w:numPr>
+      </w:pPr>
+      <w:r>
+        <w:rPr>
+          <w:rStyle w:val="VerbatimChar"/>
+        </w:rPr>
+        <w:t xml:space="preserve">GSODR</w:t>
+      </w:r>
+      <w:r>
+        <w:t xml:space="preserve"> </w:t>
+      </w:r>
+      <w:r>
+        <w:t xml:space="preserve">needs a</w:t>
+      </w:r>
+      <w:r>
+        <w:t xml:space="preserve"> </w:t>
+      </w:r>
+      <w:r>
+        <w:rPr>
+          <w:b/>
+          <w:bCs/>
+        </w:rPr>
+        <w:t xml:space="preserve">station ID</w:t>
+      </w:r>
+    </w:p>
+    <w:p>
+      <w:pPr>
+        <w:pStyle w:val="Compact"/>
+        <w:numPr>
+          <w:ilvl w:val="1"/>
+          <w:numId w:val="1070"/>
+        </w:numPr>
+      </w:pPr>
+      <w:r>
+        <w:t xml:space="preserve">most stations outside the US have</w:t>
+      </w:r>
+      <w:r>
+        <w:t xml:space="preserve"> </w:t>
+      </w:r>
+      <w:r>
+        <w:rPr>
+          <w:b/>
+          <w:bCs/>
+        </w:rPr>
+        <w:t xml:space="preserve">missing years</w:t>
+      </w:r>
+    </w:p>
+    <w:p>
+      <w:pPr>
+        <w:pStyle w:val="Compact"/>
+        <w:numPr>
+          <w:ilvl w:val="1"/>
+          <w:numId w:val="1070"/>
+        </w:numPr>
+      </w:pPr>
+      <w:r>
+        <w:t xml:space="preserve">Melbourne’s nearest long station is missing</w:t>
+      </w:r>
+      <w:r>
+        <w:t xml:space="preserve"> </w:t>
+      </w:r>
+      <w:r>
+        <w:rPr>
+          <w:b/>
+          <w:bCs/>
+        </w:rPr>
+        <w:t xml:space="preserve">48 of 59</w:t>
+      </w:r>
+    </w:p>
+    <w:p>
+      <w:pPr>
+        <w:pStyle w:val="Compact"/>
+        <w:numPr>
+          <w:ilvl w:val="0"/>
+          <w:numId w:val="1069"/>
+        </w:numPr>
+      </w:pPr>
+      <w:r>
+        <w:rPr>
+          <w:rStyle w:val="VerbatimChar"/>
+          <w:b/>
+          <w:bCs/>
+        </w:rPr>
+        <w:t xml:space="preserve">nasapower</w:t>
+      </w:r>
+      <w:r>
+        <w:rPr>
+          <w:b/>
+          <w:bCs/>
+        </w:rPr>
+        <w:t xml:space="preserve"> </w:t>
+      </w:r>
+      <w:r>
+        <w:rPr>
+          <w:b/>
+          <w:bCs/>
+        </w:rPr>
+        <w:t xml:space="preserve">needs only coordinates</w:t>
+      </w:r>
+    </w:p>
+    <w:p>
+      <w:pPr>
+        <w:pStyle w:val="Compact"/>
+        <w:numPr>
+          <w:ilvl w:val="1"/>
+          <w:numId w:val="1071"/>
+        </w:numPr>
+      </w:pPr>
+      <w:r>
+        <w:t xml:space="preserve">anywhere on Earth,</w:t>
+      </w:r>
+      <w:r>
+        <w:t xml:space="preserve"> </w:t>
+      </w:r>
+      <w:r>
+        <w:rPr>
+          <w:b/>
+          <w:bCs/>
+        </w:rPr>
+        <w:t xml:space="preserve">1981 to now, no gaps</w:t>
+      </w:r>
+    </w:p>
+    <w:p>
+      <w:pPr>
+        <w:pStyle w:val="Compact"/>
+        <w:numPr>
+          <w:ilvl w:val="1"/>
+          <w:numId w:val="1071"/>
+        </w:numPr>
+      </w:pPr>
+      <w:r>
+        <w:t xml:space="preserve">watch the order:</w:t>
+      </w:r>
+      <w:r>
+        <w:t xml:space="preserve"> </w:t>
+      </w:r>
+      <w:r>
+        <w:rPr>
+          <w:b/>
+          <w:bCs/>
+        </w:rPr>
+        <w:t xml:space="preserve">longitude first</w:t>
+      </w:r>
+    </w:p>
+    <w:p>
+      <w:pPr>
+        <w:pStyle w:val="Compact"/>
+        <w:numPr>
+          <w:ilvl w:val="0"/>
+          <w:numId w:val="1069"/>
+        </w:numPr>
+      </w:pPr>
+      <w:r>
+        <w:rPr>
+          <w:rStyle w:val="VerbatimChar"/>
+        </w:rPr>
+        <w:t xml:space="preserve">rename()</w:t>
+      </w:r>
+      <w:r>
+        <w:t xml:space="preserve"> </w:t>
+      </w:r>
+      <w:r>
+        <w:t xml:space="preserve">makes the columns match Duluth’s</w:t>
+      </w:r>
+    </w:p>
+    <w:bookmarkEnd w:id="64"/>
+    <w:bookmarkStart w:id="67" w:name="swap-two-numbers-get-a-new-city"/>
+    <w:p>
+      <w:pPr>
+        <w:pStyle w:val="Heading1"/>
+      </w:pPr>
+      <w:r>
+        <w:t xml:space="preserve">Swap Two Numbers, Get a New City</w:t>
+      </w:r>
+    </w:p>
+    <w:p>
+      <w:pPr>
+        <w:pStyle w:val="SourceCode"/>
+      </w:pPr>
       <w:r>
         <w:rPr>
           <w:rStyle w:val="CommentTok"/>
         </w:rPr>
-        <w:t xml:space="preserve"># Duluth is 46.84 N, -92.19 W</w:t>
-      </w:r>
-      <w:r>
-        <w:br/>
+        <w:t xml:space="preserve"># The ONLY numbers that change ------------------</w:t>
+      </w:r>
+      <w:r>
+        <w:br/>
+      </w:r>
+      <w:r>
+        <w:rPr>
+          <w:rStyle w:val="NormalTok"/>
+        </w:rPr>
+        <w:t xml:space="preserve">lonlat </w:t>
+      </w:r>
+      <w:r>
+        <w:rPr>
+          <w:rStyle w:val="OtherTok"/>
+        </w:rPr>
+        <w:t xml:space="preserve">=</w:t>
+      </w:r>
+      <w:r>
+        <w:rPr>
+          <w:rStyle w:val="NormalTok"/>
+        </w:rPr>
+        <w:t xml:space="preserve"> </w:t>
       </w:r>
       <w:r>
         <w:rPr>
           <w:rStyle w:val="FunctionTok"/>
         </w:rPr>
-        <w:t xml:space="preserve">nearest_stations</w:t>
+        <w:t xml:space="preserve">c</w:t>
       </w:r>
       <w:r>
         <w:rPr>
@@ -9337,230 +10102,243 @@
       </w:r>
       <w:r>
         <w:rPr>
+          <w:rStyle w:val="SpecialCharTok"/>
+        </w:rPr>
+        <w:t xml:space="preserve">-</w:t>
+      </w:r>
+      <w:r>
+        <w:rPr>
+          <w:rStyle w:val="FloatTok"/>
+        </w:rPr>
+        <w:t xml:space="preserve">0.13</w:t>
+      </w:r>
+      <w:r>
+        <w:rPr>
+          <w:rStyle w:val="NormalTok"/>
+        </w:rPr>
+        <w:t xml:space="preserve">, </w:t>
+      </w:r>
+      <w:r>
+        <w:rPr>
+          <w:rStyle w:val="FloatTok"/>
+        </w:rPr>
+        <w:t xml:space="preserve">51.51</w:t>
+      </w:r>
+      <w:r>
+        <w:rPr>
+          <w:rStyle w:val="NormalTok"/>
+        </w:rPr>
+        <w:t xml:space="preserve">)</w:t>
+      </w:r>
+      <w:r>
+        <w:br/>
+      </w:r>
+      <w:r>
+        <w:br/>
+      </w:r>
+      <w:r>
+        <w:rPr>
+          <w:rStyle w:val="CommentTok"/>
+        </w:rPr>
+        <w:t xml:space="preserve"># Everything below is identical -----------------</w:t>
+      </w:r>
+      <w:r>
+        <w:br/>
+      </w:r>
+      <w:r>
+        <w:rPr>
+          <w:rStyle w:val="NormalTok"/>
+        </w:rPr>
+        <w:t xml:space="preserve">city_year_df </w:t>
+      </w:r>
+      <w:r>
+        <w:rPr>
+          <w:rStyle w:val="OtherTok"/>
+        </w:rPr>
+        <w:t xml:space="preserve">&lt;-</w:t>
+      </w:r>
+      <w:r>
+        <w:rPr>
+          <w:rStyle w:val="NormalTok"/>
+        </w:rPr>
+        <w:t xml:space="preserve"> city_df </w:t>
+      </w:r>
+      <w:r>
+        <w:rPr>
+          <w:rStyle w:val="SpecialCharTok"/>
+        </w:rPr>
+        <w:t xml:space="preserve">%&gt;%</w:t>
+      </w:r>
+      <w:r>
+        <w:br/>
+      </w:r>
+      <w:r>
+        <w:rPr>
+          <w:rStyle w:val="NormalTok"/>
+        </w:rPr>
+        <w:t xml:space="preserve">  </w:t>
+      </w:r>
+      <w:r>
+        <w:rPr>
+          <w:rStyle w:val="FunctionTok"/>
+        </w:rPr>
+        <w:t xml:space="preserve">group_by</w:t>
+      </w:r>
+      <w:r>
+        <w:rPr>
+          <w:rStyle w:val="NormalTok"/>
+        </w:rPr>
+        <w:t xml:space="preserve">(year) </w:t>
+      </w:r>
+      <w:r>
+        <w:rPr>
+          <w:rStyle w:val="SpecialCharTok"/>
+        </w:rPr>
+        <w:t xml:space="preserve">%&gt;%</w:t>
+      </w:r>
+      <w:r>
+        <w:br/>
+      </w:r>
+      <w:r>
+        <w:rPr>
+          <w:rStyle w:val="NormalTok"/>
+        </w:rPr>
+        <w:t xml:space="preserve">  </w:t>
+      </w:r>
+      <w:r>
+        <w:rPr>
+          <w:rStyle w:val="FunctionTok"/>
+        </w:rPr>
+        <w:t xml:space="preserve">summarize</w:t>
+      </w:r>
+      <w:r>
+        <w:rPr>
+          <w:rStyle w:val="NormalTok"/>
+        </w:rPr>
+        <w:t xml:space="preserve">(</w:t>
+      </w:r>
+      <w:r>
+        <w:rPr>
           <w:rStyle w:val="AttributeTok"/>
         </w:rPr>
-        <w:t xml:space="preserve">LAT =</w:t>
-      </w:r>
-      <w:r>
-        <w:rPr>
-          <w:rStyle w:val="NormalTok"/>
-        </w:rPr>
-        <w:t xml:space="preserve"> </w:t>
-      </w:r>
-      <w:r>
-        <w:rPr>
-          <w:rStyle w:val="FloatTok"/>
-        </w:rPr>
-        <w:t xml:space="preserve">46.84</w:t>
-      </w:r>
-      <w:r>
-        <w:rPr>
-          <w:rStyle w:val="NormalTok"/>
-        </w:rPr>
-        <w:t xml:space="preserve">, </w:t>
+        <w:t xml:space="preserve">temp =</w:t>
+      </w:r>
+      <w:r>
+        <w:rPr>
+          <w:rStyle w:val="NormalTok"/>
+        </w:rPr>
+        <w:t xml:space="preserve"> </w:t>
+      </w:r>
+      <w:r>
+        <w:rPr>
+          <w:rStyle w:val="FunctionTok"/>
+        </w:rPr>
+        <w:t xml:space="preserve">mean</w:t>
+      </w:r>
+      <w:r>
+        <w:rPr>
+          <w:rStyle w:val="NormalTok"/>
+        </w:rPr>
+        <w:t xml:space="preserve">(temp, </w:t>
       </w:r>
       <w:r>
         <w:rPr>
           <w:rStyle w:val="AttributeTok"/>
         </w:rPr>
-        <w:t xml:space="preserve">LON =</w:t>
-      </w:r>
-      <w:r>
-        <w:rPr>
-          <w:rStyle w:val="NormalTok"/>
-        </w:rPr>
-        <w:t xml:space="preserve"> </w:t>
+        <w:t xml:space="preserve">na.rm =</w:t>
+      </w:r>
+      <w:r>
+        <w:rPr>
+          <w:rStyle w:val="NormalTok"/>
+        </w:rPr>
+        <w:t xml:space="preserve"> </w:t>
+      </w:r>
+      <w:r>
+        <w:rPr>
+          <w:rStyle w:val="ConstantTok"/>
+        </w:rPr>
+        <w:t xml:space="preserve">TRUE</w:t>
+      </w:r>
+      <w:r>
+        <w:rPr>
+          <w:rStyle w:val="NormalTok"/>
+        </w:rPr>
+        <w:t xml:space="preserve">))</w:t>
+      </w:r>
+      <w:r>
+        <w:br/>
+      </w:r>
+      <w:r>
+        <w:br/>
+      </w:r>
+      <w:r>
+        <w:rPr>
+          <w:rStyle w:val="NormalTok"/>
+        </w:rPr>
+        <w:t xml:space="preserve">city_model </w:t>
+      </w:r>
+      <w:r>
+        <w:rPr>
+          <w:rStyle w:val="OtherTok"/>
+        </w:rPr>
+        <w:t xml:space="preserve">&lt;-</w:t>
+      </w:r>
+      <w:r>
+        <w:rPr>
+          <w:rStyle w:val="NormalTok"/>
+        </w:rPr>
+        <w:t xml:space="preserve"> </w:t>
+      </w:r>
+      <w:r>
+        <w:rPr>
+          <w:rStyle w:val="FunctionTok"/>
+        </w:rPr>
+        <w:t xml:space="preserve">lm</w:t>
+      </w:r>
+      <w:r>
+        <w:rPr>
+          <w:rStyle w:val="NormalTok"/>
+        </w:rPr>
+        <w:t xml:space="preserve">(temp </w:t>
       </w:r>
       <w:r>
         <w:rPr>
           <w:rStyle w:val="SpecialCharTok"/>
         </w:rPr>
-        <w:t xml:space="preserve">-</w:t>
-      </w:r>
-      <w:r>
-        <w:rPr>
-          <w:rStyle w:val="FloatTok"/>
-        </w:rPr>
-        <w:t xml:space="preserve">92.19</w:t>
-      </w:r>
-      <w:r>
-        <w:rPr>
-          <w:rStyle w:val="NormalTok"/>
-        </w:rPr>
-        <w:t xml:space="preserve">,</w:t>
-      </w:r>
-      <w:r>
-        <w:br/>
-      </w:r>
-      <w:r>
-        <w:rPr>
-          <w:rStyle w:val="NormalTok"/>
-        </w:rPr>
-        <w:t xml:space="preserve">                 </w:t>
+        <w:t xml:space="preserve">~</w:t>
+      </w:r>
+      <w:r>
+        <w:rPr>
+          <w:rStyle w:val="NormalTok"/>
+        </w:rPr>
+        <w:t xml:space="preserve"> year, </w:t>
       </w:r>
       <w:r>
         <w:rPr>
           <w:rStyle w:val="AttributeTok"/>
         </w:rPr>
-        <w:t xml:space="preserve">distance =</w:t>
-      </w:r>
-      <w:r>
-        <w:rPr>
-          <w:rStyle w:val="NormalTok"/>
-        </w:rPr>
-        <w:t xml:space="preserve"> </w:t>
-      </w:r>
-      <w:r>
-        <w:rPr>
-          <w:rStyle w:val="DecValTok"/>
-        </w:rPr>
-        <w:t xml:space="preserve">50</w:t>
-      </w:r>
-      <w:r>
-        <w:rPr>
-          <w:rStyle w:val="NormalTok"/>
-        </w:rPr>
-        <w:t xml:space="preserve">) </w:t>
-      </w:r>
-      <w:r>
-        <w:rPr>
-          <w:rStyle w:val="SpecialCharTok"/>
-        </w:rPr>
-        <w:t xml:space="preserve">%&gt;%</w:t>
-      </w:r>
-      <w:r>
-        <w:br/>
-      </w:r>
-      <w:r>
-        <w:rPr>
-          <w:rStyle w:val="NormalTok"/>
-        </w:rPr>
-        <w:t xml:space="preserve">  </w:t>
+        <w:t xml:space="preserve">data =</w:t>
+      </w:r>
+      <w:r>
+        <w:rPr>
+          <w:rStyle w:val="NormalTok"/>
+        </w:rPr>
+        <w:t xml:space="preserve"> city_year_df)</w:t>
+      </w:r>
+      <w:r>
+        <w:br/>
       </w:r>
       <w:r>
         <w:rPr>
           <w:rStyle w:val="FunctionTok"/>
         </w:rPr>
-        <w:t xml:space="preserve">clean_names</w:t>
-      </w:r>
-      <w:r>
-        <w:rPr>
-          <w:rStyle w:val="NormalTok"/>
-        </w:rPr>
-        <w:t xml:space="preserve">() </w:t>
-      </w:r>
-      <w:r>
-        <w:rPr>
-          <w:rStyle w:val="SpecialCharTok"/>
-        </w:rPr>
-        <w:t xml:space="preserve">%&gt;%</w:t>
-      </w:r>
-      <w:r>
-        <w:br/>
-      </w:r>
-      <w:r>
-        <w:rPr>
-          <w:rStyle w:val="NormalTok"/>
-        </w:rPr>
-        <w:t xml:space="preserve">  </w:t>
-      </w:r>
-      <w:r>
-        <w:rPr>
-          <w:rStyle w:val="FunctionTok"/>
-        </w:rPr>
-        <w:t xml:space="preserve">select</w:t>
-      </w:r>
-      <w:r>
-        <w:rPr>
-          <w:rStyle w:val="NormalTok"/>
-        </w:rPr>
-        <w:t xml:space="preserve">(stnid, name, begin, end) </w:t>
-      </w:r>
-      <w:r>
-        <w:rPr>
-          <w:rStyle w:val="SpecialCharTok"/>
-        </w:rPr>
-        <w:t xml:space="preserve">%&gt;%</w:t>
-      </w:r>
-      <w:r>
-        <w:br/>
-      </w:r>
-      <w:r>
-        <w:rPr>
-          <w:rStyle w:val="NormalTok"/>
-        </w:rPr>
-        <w:t xml:space="preserve">  </w:t>
-      </w:r>
-      <w:r>
-        <w:rPr>
-          <w:rStyle w:val="FunctionTok"/>
-        </w:rPr>
-        <w:t xml:space="preserve">head</w:t>
-      </w:r>
-      <w:r>
-        <w:rPr>
-          <w:rStyle w:val="NormalTok"/>
-        </w:rPr>
-        <w:t xml:space="preserve">(</w:t>
-      </w:r>
-      <w:r>
-        <w:rPr>
-          <w:rStyle w:val="DecValTok"/>
-        </w:rPr>
-        <w:t xml:space="preserve">3</w:t>
-      </w:r>
-      <w:r>
-        <w:rPr>
-          <w:rStyle w:val="NormalTok"/>
-        </w:rPr>
-        <w:t xml:space="preserve">)</w:t>
-      </w:r>
-    </w:p>
-    <w:p>
-      <w:pPr>
-        <w:pStyle w:val="SourceCode"/>
-      </w:pPr>
-      <w:r>
-        <w:rPr>
-          <w:rStyle w:val="VerbatimChar"/>
-        </w:rPr>
-        <w:t xml:space="preserve">          stnid                         name    begin      end</w:t>
-      </w:r>
-      <w:r>
-        <w:br/>
-      </w:r>
-      <w:r>
-        <w:rPr>
-          <w:rStyle w:val="VerbatimChar"/>
-        </w:rPr>
-        <w:t xml:space="preserve">         &lt;char&gt;                       &lt;char&gt;    &lt;int&gt;    &lt;int&gt;</w:t>
-      </w:r>
-      <w:r>
-        <w:br/>
-      </w:r>
-      <w:r>
-        <w:rPr>
-          <w:rStyle w:val="VerbatimChar"/>
-        </w:rPr>
-        <w:t xml:space="preserve">1: 727450-14913 DULUTH INTERNATIONAL AIRPORT 19480101 20250827</w:t>
-      </w:r>
-      <w:r>
-        <w:br/>
-      </w:r>
-      <w:r>
-        <w:rPr>
-          <w:rStyle w:val="VerbatimChar"/>
-        </w:rPr>
-        <w:t xml:space="preserve">2: 999999-14913 DULUTH WILLIAMSN-JOHNSN MUNI 19650101 19721231</w:t>
-      </w:r>
-      <w:r>
-        <w:br/>
-      </w:r>
-      <w:r>
-        <w:rPr>
-          <w:rStyle w:val="VerbatimChar"/>
-        </w:rPr>
-        <w:t xml:space="preserve">3: 997269-99999                       DULUTH 20080101 20081231</w:t>
+        <w:t xml:space="preserve">summary</w:t>
+      </w:r>
+      <w:r>
+        <w:rPr>
+          <w:rStyle w:val="NormalTok"/>
+        </w:rPr>
+        <w:t xml:space="preserve">(city_model)</w:t>
       </w:r>
     </w:p>
     <w:p>
@@ -9568,46 +10346,45 @@
         <w:pStyle w:val="Compact"/>
         <w:numPr>
           <w:ilvl w:val="0"/>
-          <w:numId w:val="1067"/>
-        </w:numPr>
-      </w:pPr>
-      <w:r>
-        <w:rPr>
-          <w:rStyle w:val="VerbatimChar"/>
-        </w:rPr>
-        <w:t xml:space="preserve">nearest_stations()</w:t>
-      </w:r>
-      <w:r>
-        <w:t xml:space="preserve"> </w:t>
-      </w:r>
-      <w:r>
-        <w:t xml:space="preserve">takes a</w:t>
-      </w:r>
-      <w:r>
-        <w:t xml:space="preserve"> </w:t>
-      </w:r>
-      <w:r>
-        <w:rPr>
-          <w:b/>
-          <w:bCs/>
-        </w:rPr>
-        <w:t xml:space="preserve">latitude</w:t>
-      </w:r>
-      <w:r>
-        <w:t xml:space="preserve">, a</w:t>
-      </w:r>
-      <w:r>
-        <w:t xml:space="preserve"> </w:t>
-      </w:r>
-      <w:r>
-        <w:rPr>
-          <w:b/>
-          <w:bCs/>
-        </w:rPr>
-        <w:t xml:space="preserve">longitude</w:t>
-      </w:r>
-      <w:r>
-        <w:t xml:space="preserve">, and a radius in km</w:t>
+          <w:numId w:val="1072"/>
+        </w:numPr>
+      </w:pPr>
+      <w:r>
+        <w:t xml:space="preserve">That is the whole point of today</w:t>
+      </w:r>
+    </w:p>
+    <w:p>
+      <w:pPr>
+        <w:pStyle w:val="Compact"/>
+        <w:numPr>
+          <w:ilvl w:val="1"/>
+          <w:numId w:val="1073"/>
+        </w:numPr>
+      </w:pPr>
+      <w:r>
+        <w:rPr>
+          <w:b/>
+          <w:bCs/>
+        </w:rPr>
+        <w:t xml:space="preserve">two numbers</w:t>
+      </w:r>
+      <w:r>
+        <w:t xml:space="preserve"> </w:t>
+      </w:r>
+      <w:r>
+        <w:t xml:space="preserve">name the place</w:t>
+      </w:r>
+    </w:p>
+    <w:p>
+      <w:pPr>
+        <w:pStyle w:val="Compact"/>
+        <w:numPr>
+          <w:ilvl w:val="1"/>
+          <w:numId w:val="1073"/>
+        </w:numPr>
+      </w:pPr>
+      <w:r>
+        <w:t xml:space="preserve">the rest of the analysis never changes</w:t>
       </w:r>
     </w:p>
     <w:p>
@@ -9615,11 +10392,11 @@
         <w:pStyle w:val="Compact"/>
         <w:numPr>
           <w:ilvl w:val="0"/>
-          <w:numId w:val="1067"/>
-        </w:numPr>
-      </w:pPr>
-      <w:r>
-        <w:t xml:space="preserve">Look up your city’s lat/long in any search engine</w:t>
+          <w:numId w:val="1072"/>
+        </w:numPr>
+      </w:pPr>
+      <w:r>
+        <w:t xml:space="preserve">Look up lat/long in any search engine</w:t>
       </w:r>
     </w:p>
     <w:p>
@@ -9627,7 +10404,7 @@
         <w:pStyle w:val="Compact"/>
         <w:numPr>
           <w:ilvl w:val="1"/>
-          <w:numId w:val="1068"/>
+          <w:numId w:val="1074"/>
         </w:numPr>
       </w:pPr>
       <w:r>
@@ -9649,7 +10426,7 @@
         <w:pStyle w:val="Compact"/>
         <w:numPr>
           <w:ilvl w:val="1"/>
-          <w:numId w:val="1068"/>
+          <w:numId w:val="1074"/>
         </w:numPr>
       </w:pPr>
       <w:r>
@@ -9664,90 +10441,6 @@
       </w:r>
       <w:r>
         <w:t xml:space="preserve">of Greenwich → negative longitude</w:t>
-      </w:r>
-    </w:p>
-    <w:p>
-      <w:pPr>
-        <w:pStyle w:val="Compact"/>
-        <w:numPr>
-          <w:ilvl w:val="0"/>
-          <w:numId w:val="1067"/>
-        </w:numPr>
-      </w:pPr>
-      <w:r>
-        <w:t xml:space="preserve">Then read the table:</w:t>
-      </w:r>
-    </w:p>
-    <w:p>
-      <w:pPr>
-        <w:pStyle w:val="Compact"/>
-        <w:numPr>
-          <w:ilvl w:val="1"/>
-          <w:numId w:val="1069"/>
-        </w:numPr>
-      </w:pPr>
-      <w:r>
-        <w:rPr>
-          <w:rStyle w:val="VerbatimChar"/>
-          <w:b/>
-          <w:bCs/>
-        </w:rPr>
-        <w:t xml:space="preserve">stnid</w:t>
-      </w:r>
-      <w:r>
-        <w:t xml:space="preserve"> </w:t>
-      </w:r>
-      <w:r>
-        <w:t xml:space="preserve">is what you paste into</w:t>
-      </w:r>
-      <w:r>
-        <w:t xml:space="preserve"> </w:t>
-      </w:r>
-      <w:r>
-        <w:rPr>
-          <w:rStyle w:val="VerbatimChar"/>
-        </w:rPr>
-        <w:t xml:space="preserve">get_GSOD()</w:t>
-      </w:r>
-    </w:p>
-    <w:p>
-      <w:pPr>
-        <w:pStyle w:val="Compact"/>
-        <w:numPr>
-          <w:ilvl w:val="1"/>
-          <w:numId w:val="1069"/>
-        </w:numPr>
-      </w:pPr>
-      <w:r>
-        <w:rPr>
-          <w:rStyle w:val="VerbatimChar"/>
-          <w:b/>
-          <w:bCs/>
-        </w:rPr>
-        <w:t xml:space="preserve">begin</w:t>
-      </w:r>
-      <w:r>
-        <w:t xml:space="preserve"> </w:t>
-      </w:r>
-      <w:r>
-        <w:t xml:space="preserve">and</w:t>
-      </w:r>
-      <w:r>
-        <w:t xml:space="preserve"> </w:t>
-      </w:r>
-      <w:r>
-        <w:rPr>
-          <w:rStyle w:val="VerbatimChar"/>
-          <w:b/>
-          <w:bCs/>
-        </w:rPr>
-        <w:t xml:space="preserve">end</w:t>
-      </w:r>
-      <w:r>
-        <w:t xml:space="preserve"> </w:t>
-      </w:r>
-      <w:r>
-        <w:t xml:space="preserve">tell you the years available</w:t>
       </w:r>
     </w:p>
     <w:tbl>
@@ -9791,12 +10484,12 @@
                 <wp:inline>
                   <wp:extent cx="152400" cy="152400"/>
                   <wp:effectExtent b="0" l="0" r="0" t="0"/>
-                  <wp:docPr descr="" title="" id="64" name="Picture"/>
+                  <wp:docPr descr="" title="" id="65" name="Picture"/>
                   <a:graphic>
                     <a:graphicData uri="http://schemas.openxmlformats.org/drawingml/2006/picture">
                       <pic:pic>
                         <pic:nvPicPr>
-                          <pic:cNvPr descr="/Applications/Positron.app/Contents/Resources/app/quarto/share/formats/docx/important.png" id="65" name="Picture"/>
+                          <pic:cNvPr descr="/Applications/Positron.app/Contents/Resources/app/quarto/share/formats/docx/important.png" id="66" name="Picture"/>
                           <pic:cNvPicPr>
                             <a:picLocks noChangeArrowheads="1" noChangeAspect="1"/>
                           </pic:cNvPicPr>
@@ -9856,20 +10549,20 @@
               <w:pStyle w:val="BodyText"/>
             </w:pPr>
             <w:pPr>
-              <w:spacing w:before="16" w:after="16"/>
+              <w:spacing w:before="16"/>
             </w:pPr>
             <w:r>
               <w:rPr>
                 <w:b/>
                 <w:bCs/>
               </w:rPr>
-              <w:t xml:space="preserve">Pick a station with a long record.</w:t>
+              <w:t xml:space="preserve">Southern hemisphere?</w:t>
             </w:r>
             <w:r>
               <w:t xml:space="preserve"> </w:t>
             </w:r>
             <w:r>
-              <w:t xml:space="preserve">A trend needs decades — aim for a</w:t>
+              <w:t xml:space="preserve">Swap the season labels in</w:t>
             </w:r>
             <w:r>
               <w:t xml:space="preserve"> </w:t>
@@ -9878,27 +10571,86 @@
               <w:rPr>
                 <w:rStyle w:val="VerbatimChar"/>
               </w:rPr>
-              <w:t xml:space="preserve">begin</w:t>
+              <w:t xml:space="preserve">case_when()</w:t>
+            </w:r>
+            <w:r>
+              <w:t xml:space="preserve">:</w:t>
+            </w:r>
+          </w:p>
+          <w:p>
+            <w:pPr>
+              <w:pStyle w:val="Compact"/>
+              <w:numPr>
+                <w:ilvl w:val="0"/>
+                <w:numId w:val="1075"/>
+              </w:numPr>
+            </w:pPr>
+            <w:r>
+              <w:rPr>
+                <w:rStyle w:val="VerbatimChar"/>
+              </w:rPr>
+              <w:t xml:space="preserve">month %in% c(12, 1, 2)</w:t>
             </w:r>
             <w:r>
               <w:t xml:space="preserve"> </w:t>
             </w:r>
             <w:r>
-              <w:t xml:space="preserve">date of 1970 or earlier.</w:t>
+              <w:t xml:space="preserve">→</w:t>
+            </w:r>
+            <w:r>
+              <w:t xml:space="preserve"> </w:t>
+            </w:r>
+            <w:r>
+              <w:rPr>
+                <w:b/>
+                <w:bCs/>
+              </w:rPr>
+              <w:t xml:space="preserve">summer</w:t>
+            </w:r>
+          </w:p>
+          <w:p>
+            <w:pPr>
+              <w:pStyle w:val="Compact"/>
+              <w:numPr>
+                <w:ilvl w:val="0"/>
+                <w:numId w:val="1075"/>
+              </w:numPr>
+            </w:pPr>
+            <w:r>
+              <w:rPr>
+                <w:rStyle w:val="VerbatimChar"/>
+              </w:rPr>
+              <w:t xml:space="preserve">month %in% c(6, 7, 8)</w:t>
+            </w:r>
+            <w:r>
+              <w:t xml:space="preserve"> </w:t>
+            </w:r>
+            <w:r>
+              <w:t xml:space="preserve">→</w:t>
+            </w:r>
+            <w:r>
+              <w:t xml:space="preserve"> </w:t>
+            </w:r>
+            <w:r>
+              <w:rPr>
+                <w:b/>
+                <w:bCs/>
+              </w:rPr>
+              <w:t xml:space="preserve">winter</w:t>
             </w:r>
           </w:p>
           <w:p/>
         </w:tc>
       </w:tr>
     </w:tbl>
-    <w:bookmarkEnd w:id="66"/>
-    <w:bookmarkStart w:id="69" w:name="swap-one-line-get-a-new-city"/>
+    <w:bookmarkEnd w:id="67"/>
+    <w:bookmarkStart w:id="70" w:name="are-the-two-slopes-different"/>
     <w:p>
       <w:pPr>
         <w:pStyle w:val="Heading1"/>
       </w:pPr>
       <w:r>
-        <w:t xml:space="preserve">Swap One Line, Get a New City</w:t>
+        <w:t xml:space="preserve">Are the Two Slopes Different?</w:t>
       </w:r>
     </w:p>
     <w:p>
@@ -9909,16 +10661,16 @@
         <w:rPr>
           <w:rStyle w:val="CommentTok"/>
         </w:rPr>
-        <w:t xml:space="preserve"># The ONLY line that changes ---------------------------</w:t>
-      </w:r>
-      <w:r>
-        <w:br/>
-      </w:r>
-      <w:r>
-        <w:rPr>
-          <w:rStyle w:val="NormalTok"/>
-        </w:rPr>
-        <w:t xml:space="preserve">city_df </w:t>
+        <w:t xml:space="preserve"># Stack the two yearly summaries ----------------</w:t>
+      </w:r>
+      <w:r>
+        <w:br/>
+      </w:r>
+      <w:r>
+        <w:rPr>
+          <w:rStyle w:val="NormalTok"/>
+        </w:rPr>
+        <w:t xml:space="preserve">both_df </w:t>
       </w:r>
       <w:r>
         <w:rPr>
@@ -9936,319 +10688,145 @@
         <w:rPr>
           <w:rStyle w:val="FunctionTok"/>
         </w:rPr>
-        <w:t xml:space="preserve">get_GSOD</w:t>
-      </w:r>
-      <w:r>
-        <w:rPr>
-          <w:rStyle w:val="NormalTok"/>
-        </w:rPr>
-        <w:t xml:space="preserve">(</w:t>
+        <w:t xml:space="preserve">bind_rows</w:t>
+      </w:r>
+      <w:r>
+        <w:rPr>
+          <w:rStyle w:val="NormalTok"/>
+        </w:rPr>
+        <w:t xml:space="preserve">(duluth_year_df,</w:t>
+      </w:r>
+      <w:r>
+        <w:br/>
+      </w:r>
+      <w:r>
+        <w:rPr>
+          <w:rStyle w:val="NormalTok"/>
+        </w:rPr>
+        <w:t xml:space="preserve">                     city_labeled_df)</w:t>
+      </w:r>
+      <w:r>
+        <w:br/>
+      </w:r>
+      <w:r>
+        <w:br/>
+      </w:r>
+      <w:r>
+        <w:rPr>
+          <w:rStyle w:val="CommentTok"/>
+        </w:rPr>
+        <w:t xml:space="preserve"># One slope per station -------------------------</w:t>
+      </w:r>
+      <w:r>
+        <w:br/>
+      </w:r>
+      <w:r>
+        <w:rPr>
+          <w:rStyle w:val="NormalTok"/>
+        </w:rPr>
+        <w:t xml:space="preserve">slope_model </w:t>
+      </w:r>
+      <w:r>
+        <w:rPr>
+          <w:rStyle w:val="OtherTok"/>
+        </w:rPr>
+        <w:t xml:space="preserve">&lt;-</w:t>
+      </w:r>
+      <w:r>
+        <w:rPr>
+          <w:rStyle w:val="NormalTok"/>
+        </w:rPr>
+        <w:t xml:space="preserve"> </w:t>
+      </w:r>
+      <w:r>
+        <w:rPr>
+          <w:rStyle w:val="FunctionTok"/>
+        </w:rPr>
+        <w:t xml:space="preserve">lm</w:t>
+      </w:r>
+      <w:r>
+        <w:rPr>
+          <w:rStyle w:val="NormalTok"/>
+        </w:rPr>
+        <w:t xml:space="preserve">(temp </w:t>
+      </w:r>
+      <w:r>
+        <w:rPr>
+          <w:rStyle w:val="SpecialCharTok"/>
+        </w:rPr>
+        <w:t xml:space="preserve">~</w:t>
+      </w:r>
+      <w:r>
+        <w:rPr>
+          <w:rStyle w:val="NormalTok"/>
+        </w:rPr>
+        <w:t xml:space="preserve"> year </w:t>
+      </w:r>
+      <w:r>
+        <w:rPr>
+          <w:rStyle w:val="SpecialCharTok"/>
+        </w:rPr>
+        <w:t xml:space="preserve">*</w:t>
+      </w:r>
+      <w:r>
+        <w:rPr>
+          <w:rStyle w:val="NormalTok"/>
+        </w:rPr>
+        <w:t xml:space="preserve"> station,</w:t>
+      </w:r>
+      <w:r>
+        <w:br/>
+      </w:r>
+      <w:r>
+        <w:rPr>
+          <w:rStyle w:val="NormalTok"/>
+        </w:rPr>
+        <w:t xml:space="preserve">                  </w:t>
       </w:r>
       <w:r>
         <w:rPr>
           <w:rStyle w:val="AttributeTok"/>
         </w:rPr>
-        <w:t xml:space="preserve">years =</w:t>
-      </w:r>
-      <w:r>
-        <w:rPr>
-          <w:rStyle w:val="NormalTok"/>
-        </w:rPr>
-        <w:t xml:space="preserve"> </w:t>
-      </w:r>
-      <w:r>
-        <w:rPr>
-          <w:rStyle w:val="DecValTok"/>
-        </w:rPr>
-        <w:t xml:space="preserve">1973</w:t>
-      </w:r>
-      <w:r>
-        <w:rPr>
-          <w:rStyle w:val="SpecialCharTok"/>
-        </w:rPr>
-        <w:t xml:space="preserve">:</w:t>
-      </w:r>
-      <w:r>
-        <w:rPr>
-          <w:rStyle w:val="DecValTok"/>
-        </w:rPr>
-        <w:t xml:space="preserve">2025</w:t>
-      </w:r>
-      <w:r>
-        <w:rPr>
-          <w:rStyle w:val="NormalTok"/>
-        </w:rPr>
-        <w:t xml:space="preserve">,</w:t>
-      </w:r>
-      <w:r>
-        <w:br/>
-      </w:r>
-      <w:r>
-        <w:rPr>
-          <w:rStyle w:val="NormalTok"/>
-        </w:rPr>
-        <w:t xml:space="preserve">                    </w:t>
-      </w:r>
-      <w:r>
-        <w:rPr>
-          <w:rStyle w:val="AttributeTok"/>
-        </w:rPr>
-        <w:t xml:space="preserve">station =</w:t>
-      </w:r>
-      <w:r>
-        <w:rPr>
-          <w:rStyle w:val="NormalTok"/>
-        </w:rPr>
-        <w:t xml:space="preserve"> </w:t>
-      </w:r>
-      <w:r>
-        <w:rPr>
-          <w:rStyle w:val="StringTok"/>
-        </w:rPr>
-        <w:t xml:space="preserve">"948660-99999"</w:t>
-      </w:r>
-      <w:r>
-        <w:rPr>
-          <w:rStyle w:val="NormalTok"/>
-        </w:rPr>
-        <w:t xml:space="preserve">) </w:t>
-      </w:r>
-      <w:r>
-        <w:rPr>
-          <w:rStyle w:val="SpecialCharTok"/>
-        </w:rPr>
-        <w:t xml:space="preserve">%&gt;%</w:t>
-      </w:r>
-      <w:r>
-        <w:br/>
-      </w:r>
-      <w:r>
-        <w:rPr>
-          <w:rStyle w:val="NormalTok"/>
-        </w:rPr>
-        <w:t xml:space="preserve">  </w:t>
+        <w:t xml:space="preserve">data =</w:t>
+      </w:r>
+      <w:r>
+        <w:rPr>
+          <w:rStyle w:val="NormalTok"/>
+        </w:rPr>
+        <w:t xml:space="preserve"> both_df)</w:t>
+      </w:r>
+      <w:r>
+        <w:br/>
       </w:r>
       <w:r>
         <w:rPr>
           <w:rStyle w:val="FunctionTok"/>
         </w:rPr>
-        <w:t xml:space="preserve">clean_names</w:t>
-      </w:r>
-      <w:r>
-        <w:rPr>
-          <w:rStyle w:val="NormalTok"/>
-        </w:rPr>
-        <w:t xml:space="preserve">()</w:t>
-      </w:r>
-      <w:r>
-        <w:br/>
-      </w:r>
-      <w:r>
-        <w:br/>
-      </w:r>
-      <w:r>
-        <w:rPr>
-          <w:rStyle w:val="CommentTok"/>
-        </w:rPr>
-        <w:t xml:space="preserve"># Everything below is identical ------------------------</w:t>
-      </w:r>
-      <w:r>
-        <w:br/>
-      </w:r>
-      <w:r>
-        <w:rPr>
-          <w:rStyle w:val="NormalTok"/>
-        </w:rPr>
-        <w:t xml:space="preserve">city_year_df </w:t>
-      </w:r>
-      <w:r>
-        <w:rPr>
-          <w:rStyle w:val="OtherTok"/>
-        </w:rPr>
-        <w:t xml:space="preserve">&lt;-</w:t>
-      </w:r>
-      <w:r>
-        <w:rPr>
-          <w:rStyle w:val="NormalTok"/>
-        </w:rPr>
-        <w:t xml:space="preserve"> city_df </w:t>
-      </w:r>
-      <w:r>
-        <w:rPr>
-          <w:rStyle w:val="SpecialCharTok"/>
-        </w:rPr>
-        <w:t xml:space="preserve">%&gt;%</w:t>
-      </w:r>
-      <w:r>
-        <w:br/>
-      </w:r>
-      <w:r>
-        <w:rPr>
-          <w:rStyle w:val="NormalTok"/>
-        </w:rPr>
-        <w:t xml:space="preserve">  </w:t>
-      </w:r>
-      <w:r>
-        <w:rPr>
-          <w:rStyle w:val="FunctionTok"/>
-        </w:rPr>
-        <w:t xml:space="preserve">group_by</w:t>
-      </w:r>
-      <w:r>
-        <w:rPr>
-          <w:rStyle w:val="NormalTok"/>
-        </w:rPr>
-        <w:t xml:space="preserve">(year) </w:t>
-      </w:r>
-      <w:r>
-        <w:rPr>
-          <w:rStyle w:val="SpecialCharTok"/>
-        </w:rPr>
-        <w:t xml:space="preserve">%&gt;%</w:t>
-      </w:r>
-      <w:r>
-        <w:br/>
-      </w:r>
-      <w:r>
-        <w:rPr>
-          <w:rStyle w:val="NormalTok"/>
-        </w:rPr>
-        <w:t xml:space="preserve">  </w:t>
-      </w:r>
-      <w:r>
-        <w:rPr>
-          <w:rStyle w:val="FunctionTok"/>
-        </w:rPr>
-        <w:t xml:space="preserve">summarize</w:t>
-      </w:r>
-      <w:r>
-        <w:rPr>
-          <w:rStyle w:val="NormalTok"/>
-        </w:rPr>
-        <w:t xml:space="preserve">(</w:t>
-      </w:r>
-      <w:r>
-        <w:rPr>
-          <w:rStyle w:val="AttributeTok"/>
-        </w:rPr>
-        <w:t xml:space="preserve">temp =</w:t>
-      </w:r>
-      <w:r>
-        <w:rPr>
-          <w:rStyle w:val="NormalTok"/>
-        </w:rPr>
-        <w:t xml:space="preserve"> </w:t>
-      </w:r>
-      <w:r>
-        <w:rPr>
-          <w:rStyle w:val="FunctionTok"/>
-        </w:rPr>
-        <w:t xml:space="preserve">mean</w:t>
-      </w:r>
-      <w:r>
-        <w:rPr>
-          <w:rStyle w:val="NormalTok"/>
-        </w:rPr>
-        <w:t xml:space="preserve">(temp, </w:t>
-      </w:r>
-      <w:r>
-        <w:rPr>
-          <w:rStyle w:val="AttributeTok"/>
-        </w:rPr>
-        <w:t xml:space="preserve">na.rm =</w:t>
-      </w:r>
-      <w:r>
-        <w:rPr>
-          <w:rStyle w:val="NormalTok"/>
-        </w:rPr>
-        <w:t xml:space="preserve"> </w:t>
-      </w:r>
-      <w:r>
-        <w:rPr>
-          <w:rStyle w:val="ConstantTok"/>
-        </w:rPr>
-        <w:t xml:space="preserve">TRUE</w:t>
-      </w:r>
-      <w:r>
-        <w:rPr>
-          <w:rStyle w:val="NormalTok"/>
-        </w:rPr>
-        <w:t xml:space="preserve">))</w:t>
-      </w:r>
-      <w:r>
-        <w:br/>
-      </w:r>
-      <w:r>
-        <w:br/>
-      </w:r>
-      <w:r>
-        <w:rPr>
-          <w:rStyle w:val="NormalTok"/>
-        </w:rPr>
-        <w:t xml:space="preserve">city_model </w:t>
-      </w:r>
-      <w:r>
-        <w:rPr>
-          <w:rStyle w:val="OtherTok"/>
-        </w:rPr>
-        <w:t xml:space="preserve">&lt;-</w:t>
-      </w:r>
-      <w:r>
-        <w:rPr>
-          <w:rStyle w:val="NormalTok"/>
-        </w:rPr>
-        <w:t xml:space="preserve"> </w:t>
-      </w:r>
-      <w:r>
-        <w:rPr>
-          <w:rStyle w:val="FunctionTok"/>
-        </w:rPr>
-        <w:t xml:space="preserve">lm</w:t>
-      </w:r>
-      <w:r>
-        <w:rPr>
-          <w:rStyle w:val="NormalTok"/>
-        </w:rPr>
-        <w:t xml:space="preserve">(temp </w:t>
-      </w:r>
-      <w:r>
-        <w:rPr>
-          <w:rStyle w:val="SpecialCharTok"/>
-        </w:rPr>
-        <w:t xml:space="preserve">~</w:t>
-      </w:r>
-      <w:r>
-        <w:rPr>
-          <w:rStyle w:val="NormalTok"/>
-        </w:rPr>
-        <w:t xml:space="preserve"> year, </w:t>
-      </w:r>
-      <w:r>
-        <w:rPr>
-          <w:rStyle w:val="AttributeTok"/>
-        </w:rPr>
-        <w:t xml:space="preserve">data =</w:t>
-      </w:r>
-      <w:r>
-        <w:rPr>
-          <w:rStyle w:val="NormalTok"/>
-        </w:rPr>
-        <w:t xml:space="preserve"> city_year_df)</w:t>
-      </w:r>
-      <w:r>
-        <w:br/>
-      </w:r>
-      <w:r>
-        <w:rPr>
-          <w:rStyle w:val="FunctionTok"/>
-        </w:rPr>
         <w:t xml:space="preserve">summary</w:t>
       </w:r>
       <w:r>
         <w:rPr>
           <w:rStyle w:val="NormalTok"/>
         </w:rPr>
-        <w:t xml:space="preserve">(city_model)</w:t>
+        <w:t xml:space="preserve">(slope_model)</w:t>
+      </w:r>
+    </w:p>
+    <w:p>
+      <w:pPr>
+        <w:pStyle w:val="FirstParagraph"/>
+      </w:pPr>
+      <w:r>
+        <w:t xml:space="preserve">Your city and Duluth gave different numbers.</w:t>
+      </w:r>
+      <w:r>
+        <w:t xml:space="preserve"> </w:t>
+      </w:r>
+      <w:r>
+        <w:rPr>
+          <w:b/>
+          <w:bCs/>
+        </w:rPr>
+        <w:t xml:space="preserve">Different-looking slopes are not always different slopes.</w:t>
       </w:r>
     </w:p>
     <w:p>
@@ -10256,11 +10834,65 @@
         <w:pStyle w:val="Compact"/>
         <w:numPr>
           <w:ilvl w:val="0"/>
-          <w:numId w:val="1070"/>
-        </w:numPr>
-      </w:pPr>
-      <w:r>
-        <w:t xml:space="preserve">That is the whole point of today</w:t>
+          <w:numId w:val="1076"/>
+        </w:numPr>
+      </w:pPr>
+      <w:r>
+        <w:rPr>
+          <w:rStyle w:val="VerbatimChar"/>
+        </w:rPr>
+        <w:t xml:space="preserve">year * station</w:t>
+      </w:r>
+      <w:r>
+        <w:t xml:space="preserve"> </w:t>
+      </w:r>
+      <w:r>
+        <w:t xml:space="preserve">fits a</w:t>
+      </w:r>
+      <w:r>
+        <w:t xml:space="preserve"> </w:t>
+      </w:r>
+      <w:r>
+        <w:rPr>
+          <w:b/>
+          <w:bCs/>
+        </w:rPr>
+        <w:t xml:space="preserve">separate slope</w:t>
+      </w:r>
+      <w:r>
+        <w:t xml:space="preserve"> </w:t>
+      </w:r>
+      <w:r>
+        <w:t xml:space="preserve">for each place</w:t>
+      </w:r>
+    </w:p>
+    <w:p>
+      <w:pPr>
+        <w:pStyle w:val="Compact"/>
+        <w:numPr>
+          <w:ilvl w:val="0"/>
+          <w:numId w:val="1076"/>
+        </w:numPr>
+      </w:pPr>
+      <w:r>
+        <w:t xml:space="preserve">Read the</w:t>
+      </w:r>
+      <w:r>
+        <w:t xml:space="preserve"> </w:t>
+      </w:r>
+      <w:r>
+        <w:rPr>
+          <w:rStyle w:val="VerbatimChar"/>
+          <w:b/>
+          <w:bCs/>
+        </w:rPr>
+        <w:t xml:space="preserve">year:stationmy_city</w:t>
+      </w:r>
+      <w:r>
+        <w:t xml:space="preserve"> </w:t>
+      </w:r>
+      <w:r>
+        <w:t xml:space="preserve">row</w:t>
       </w:r>
     </w:p>
     <w:p>
@@ -10268,21 +10900,30 @@
         <w:pStyle w:val="Compact"/>
         <w:numPr>
           <w:ilvl w:val="1"/>
-          <w:numId w:val="1071"/>
-        </w:numPr>
-      </w:pPr>
-      <w:r>
-        <w:rPr>
-          <w:b/>
-          <w:bCs/>
-        </w:rPr>
-        <w:t xml:space="preserve">one line</w:t>
-      </w:r>
-      <w:r>
-        <w:t xml:space="preserve"> </w:t>
-      </w:r>
-      <w:r>
-        <w:t xml:space="preserve">names the place</w:t>
+          <w:numId w:val="1077"/>
+        </w:numPr>
+      </w:pPr>
+      <w:r>
+        <w:rPr>
+          <w:rStyle w:val="VerbatimChar"/>
+        </w:rPr>
+        <w:t xml:space="preserve">Estimate</w:t>
+      </w:r>
+      <w:r>
+        <w:t xml:space="preserve"> </w:t>
+      </w:r>
+      <w:r>
+        <w:t xml:space="preserve">— how much your slope</w:t>
+      </w:r>
+      <w:r>
+        <w:t xml:space="preserve"> </w:t>
+      </w:r>
+      <w:r>
+        <w:rPr>
+          <w:b/>
+          <w:bCs/>
+        </w:rPr>
+        <w:t xml:space="preserve">differs</w:t>
       </w:r>
     </w:p>
     <w:p>
@@ -10290,11 +10931,20 @@
         <w:pStyle w:val="Compact"/>
         <w:numPr>
           <w:ilvl w:val="1"/>
-          <w:numId w:val="1071"/>
-        </w:numPr>
-      </w:pPr>
-      <w:r>
-        <w:t xml:space="preserve">the rest of the analysis never changes</w:t>
+          <w:numId w:val="1077"/>
+        </w:numPr>
+      </w:pPr>
+      <w:r>
+        <w:rPr>
+          <w:rStyle w:val="VerbatimChar"/>
+        </w:rPr>
+        <w:t xml:space="preserve">Pr(&gt;|t|)</w:t>
+      </w:r>
+      <w:r>
+        <w:t xml:space="preserve"> </w:t>
+      </w:r>
+      <w:r>
+        <w:t xml:space="preserve">— is that difference real?</w:t>
       </w:r>
     </w:p>
     <w:p>
@@ -10302,35 +10952,88 @@
         <w:pStyle w:val="Compact"/>
         <w:numPr>
           <w:ilvl w:val="0"/>
-          <w:numId w:val="1070"/>
-        </w:numPr>
-      </w:pPr>
-      <w:r>
-        <w:t xml:space="preserve">Use the</w:t>
-      </w:r>
-      <w:r>
-        <w:t xml:space="preserve"> </w:t>
-      </w:r>
-      <w:r>
-        <w:rPr>
-          <w:rStyle w:val="VerbatimChar"/>
-        </w:rPr>
-        <w:t xml:space="preserve">years =</w:t>
-      </w:r>
-      <w:r>
-        <w:t xml:space="preserve"> </w:t>
-      </w:r>
-      <w:r>
-        <w:t xml:space="preserve">range your station actually has — don’t ask for years before</w:t>
-      </w:r>
-      <w:r>
-        <w:t xml:space="preserve"> </w:t>
-      </w:r>
-      <w:r>
-        <w:rPr>
-          <w:rStyle w:val="VerbatimChar"/>
-        </w:rPr>
-        <w:t xml:space="preserve">begin</w:t>
+          <w:numId w:val="1076"/>
+        </w:numPr>
+      </w:pPr>
+      <w:r>
+        <w:t xml:space="preserve">This is a</w:t>
+      </w:r>
+      <w:r>
+        <w:t xml:space="preserve"> </w:t>
+      </w:r>
+      <w:r>
+        <w:rPr>
+          <w:b/>
+          <w:bCs/>
+        </w:rPr>
+        <w:t xml:space="preserve">t-test on two slopes</w:t>
+      </w:r>
+      <w:r>
+        <w:t xml:space="preserve">, in the same two columns you have read all class</w:t>
+      </w:r>
+    </w:p>
+    <w:p>
+      <w:pPr>
+        <w:pStyle w:val="Compact"/>
+        <w:numPr>
+          <w:ilvl w:val="1"/>
+          <w:numId w:val="1078"/>
+        </w:numPr>
+      </w:pPr>
+      <w:r>
+        <w:rPr>
+          <w:i/>
+          <w:iCs/>
+        </w:rPr>
+        <w:t xml:space="preserve">p</w:t>
+      </w:r>
+      <w:r>
+        <w:t xml:space="preserve"> </w:t>
+      </w:r>
+      <w:r>
+        <w:t xml:space="preserve">&lt; 0.05 → rates</w:t>
+      </w:r>
+      <w:r>
+        <w:t xml:space="preserve"> </w:t>
+      </w:r>
+      <w:r>
+        <w:rPr>
+          <w:b/>
+          <w:bCs/>
+        </w:rPr>
+        <w:t xml:space="preserve">really differ</w:t>
+      </w:r>
+    </w:p>
+    <w:p>
+      <w:pPr>
+        <w:pStyle w:val="Compact"/>
+        <w:numPr>
+          <w:ilvl w:val="1"/>
+          <w:numId w:val="1078"/>
+        </w:numPr>
+      </w:pPr>
+      <w:r>
+        <w:rPr>
+          <w:i/>
+          <w:iCs/>
+        </w:rPr>
+        <w:t xml:space="preserve">p</w:t>
+      </w:r>
+      <w:r>
+        <w:t xml:space="preserve"> </w:t>
+      </w:r>
+      <w:r>
+        <w:t xml:space="preserve">&gt; 0.05 →</w:t>
+      </w:r>
+      <w:r>
+        <w:t xml:space="preserve"> </w:t>
+      </w:r>
+      <w:r>
+        <w:rPr>
+          <w:b/>
+          <w:bCs/>
+        </w:rPr>
+        <w:t xml:space="preserve">cannot tell them apart</w:t>
       </w:r>
     </w:p>
     <w:tbl>
@@ -10374,12 +11077,12 @@
                 <wp:inline>
                   <wp:extent cx="152400" cy="152400"/>
                   <wp:effectExtent b="0" l="0" r="0" t="0"/>
-                  <wp:docPr descr="" title="" id="67" name="Picture"/>
+                  <wp:docPr descr="" title="" id="68" name="Picture"/>
                   <a:graphic>
                     <a:graphicData uri="http://schemas.openxmlformats.org/drawingml/2006/picture">
                       <pic:pic>
                         <pic:nvPicPr>
-                          <pic:cNvPr descr="/Applications/Positron.app/Contents/Resources/app/quarto/share/formats/docx/important.png" id="68" name="Picture"/>
+                          <pic:cNvPr descr="/Applications/Positron.app/Contents/Resources/app/quarto/share/formats/docx/important.png" id="69" name="Picture"/>
                           <pic:cNvPicPr>
                             <a:picLocks noChangeArrowheads="1" noChangeAspect="1"/>
                           </pic:cNvPicPr>
@@ -10439,99 +11142,66 @@
               <w:pStyle w:val="BodyText"/>
             </w:pPr>
             <w:pPr>
-              <w:spacing w:before="16"/>
+              <w:spacing w:before="16" w:after="16"/>
             </w:pPr>
+            <w:r>
+              <w:t xml:space="preserve">Pull Duluth from the</w:t>
+            </w:r>
+            <w:r>
+              <w:t xml:space="preserve"> </w:t>
+            </w:r>
             <w:r>
               <w:rPr>
                 <w:b/>
                 <w:bCs/>
               </w:rPr>
-              <w:t xml:space="preserve">If your city is in the southern hemisphere</w:t>
-            </w:r>
-            <w:r>
-              <w:t xml:space="preserve">, swap the season labels in</w:t>
+              <w:t xml:space="preserve">same source and years</w:t>
             </w:r>
             <w:r>
               <w:t xml:space="preserve"> </w:t>
             </w:r>
             <w:r>
+              <w:t xml:space="preserve">as your city — or you are comparing place</w:t>
+            </w:r>
+            <w:r>
+              <w:t xml:space="preserve"> </w:t>
+            </w:r>
+            <w:r>
               <w:rPr>
-                <w:rStyle w:val="VerbatimChar"/>
+                <w:i/>
+                <w:iCs/>
               </w:rPr>
-              <w:t xml:space="preserve">case_when()</w:t>
-            </w:r>
-            <w:r>
-              <w:t xml:space="preserve">:</w:t>
-            </w:r>
-          </w:p>
-          <w:p>
-            <w:pPr>
-              <w:pStyle w:val="Compact"/>
-              <w:numPr>
-                <w:ilvl w:val="0"/>
-                <w:numId w:val="1072"/>
-              </w:numPr>
-            </w:pPr>
+              <w:t xml:space="preserve">plus</w:t>
+            </w:r>
+            <w:r>
+              <w:t xml:space="preserve"> </w:t>
+            </w:r>
+            <w:r>
+              <w:t xml:space="preserve">source</w:t>
+            </w:r>
+            <w:r>
+              <w:t xml:space="preserve"> </w:t>
+            </w:r>
             <w:r>
               <w:rPr>
-                <w:rStyle w:val="VerbatimChar"/>
+                <w:i/>
+                <w:iCs/>
               </w:rPr>
-              <w:t xml:space="preserve">month %in% c(12, 1, 2)</w:t>
+              <w:t xml:space="preserve">plus</w:t>
             </w:r>
             <w:r>
               <w:t xml:space="preserve"> </w:t>
             </w:r>
             <w:r>
-              <w:t xml:space="preserve">→</w:t>
-            </w:r>
-            <w:r>
-              <w:t xml:space="preserve"> </w:t>
-            </w:r>
-            <w:r>
-              <w:rPr>
-                <w:b/>
-                <w:bCs/>
-              </w:rPr>
-              <w:t xml:space="preserve">summer</w:t>
-            </w:r>
-          </w:p>
-          <w:p>
-            <w:pPr>
-              <w:pStyle w:val="Compact"/>
-              <w:numPr>
-                <w:ilvl w:val="0"/>
-                <w:numId w:val="1072"/>
-              </w:numPr>
-            </w:pPr>
-            <w:r>
-              <w:rPr>
-                <w:rStyle w:val="VerbatimChar"/>
-              </w:rPr>
-              <w:t xml:space="preserve">month %in% c(6, 7, 8)</w:t>
-            </w:r>
-            <w:r>
-              <w:t xml:space="preserve"> </w:t>
-            </w:r>
-            <w:r>
-              <w:t xml:space="preserve">→</w:t>
-            </w:r>
-            <w:r>
-              <w:t xml:space="preserve"> </w:t>
-            </w:r>
-            <w:r>
-              <w:rPr>
-                <w:b/>
-                <w:bCs/>
-              </w:rPr>
-              <w:t xml:space="preserve">winter</w:t>
+              <w:t xml:space="preserve">years.</w:t>
             </w:r>
           </w:p>
           <w:p/>
         </w:tc>
       </w:tr>
     </w:tbl>
-    <w:bookmarkEnd w:id="69"/>
-    <w:bookmarkStart w:id="70" w:name="activity-12-parts-610-now"/>
+    <w:bookmarkEnd w:id="70"/>
+    <w:bookmarkStart w:id="71" w:name="activity-12-parts-610-now"/>
     <w:p>
       <w:pPr>
         <w:pStyle w:val="Heading1"/>
@@ -10557,7 +11227,7 @@
         <w:pStyle w:val="Compact"/>
         <w:numPr>
           <w:ilvl w:val="0"/>
-          <w:numId w:val="1073"/>
+          <w:numId w:val="1079"/>
         </w:numPr>
       </w:pPr>
       <w:r>
@@ -10584,7 +11254,7 @@
         <w:pStyle w:val="Compact"/>
         <w:numPr>
           <w:ilvl w:val="0"/>
-          <w:numId w:val="1073"/>
+          <w:numId w:val="1079"/>
         </w:numPr>
       </w:pPr>
       <w:r>
@@ -10596,7 +11266,7 @@
         <w:pStyle w:val="Compact"/>
         <w:numPr>
           <w:ilvl w:val="0"/>
-          <w:numId w:val="1073"/>
+          <w:numId w:val="1079"/>
         </w:numPr>
       </w:pPr>
       <w:r>
@@ -10608,15 +11278,15 @@
         <w:pStyle w:val="Compact"/>
         <w:numPr>
           <w:ilvl w:val="0"/>
-          <w:numId w:val="1073"/>
-        </w:numPr>
-      </w:pPr>
-      <w:r>
-        <w:t xml:space="preserve">Find the station for a city you choose — that is your Extension</w:t>
-      </w:r>
-    </w:p>
-    <w:bookmarkEnd w:id="70"/>
-    <w:bookmarkStart w:id="71" w:name="what-we-learned-today"/>
+          <w:numId w:val="1079"/>
+        </w:numPr>
+      </w:pPr>
+      <w:r>
+        <w:t xml:space="preserve">Get the coordinates for a city you choose — the analysis is your homework</w:t>
+      </w:r>
+    </w:p>
+    <w:bookmarkEnd w:id="71"/>
+    <w:bookmarkStart w:id="72" w:name="what-we-learned-today"/>
     <w:p>
       <w:pPr>
         <w:pStyle w:val="Heading1"/>
@@ -10642,7 +11312,7 @@
         <w:pStyle w:val="Compact"/>
         <w:numPr>
           <w:ilvl w:val="0"/>
-          <w:numId w:val="1074"/>
+          <w:numId w:val="1080"/>
         </w:numPr>
       </w:pPr>
       <w:r>
@@ -10662,7 +11332,7 @@
         <w:t xml:space="preserve"> </w:t>
       </w:r>
       <w:r>
-        <w:t xml:space="preserve">turns a slope into a</w:t>
+        <w:t xml:space="preserve">makes the slope a</w:t>
       </w:r>
       <w:r>
         <w:t xml:space="preserve"> </w:t>
@@ -10678,7 +11348,7 @@
         <w:t xml:space="preserve"> </w:t>
       </w:r>
       <w:r>
-        <w:t xml:space="preserve">— ×10 for per decade</w:t>
+        <w:t xml:space="preserve">— ×10 per decade</w:t>
       </w:r>
     </w:p>
     <w:p>
@@ -10686,7 +11356,7 @@
         <w:pStyle w:val="Compact"/>
         <w:numPr>
           <w:ilvl w:val="0"/>
-          <w:numId w:val="1074"/>
+          <w:numId w:val="1080"/>
         </w:numPr>
       </w:pPr>
       <w:r>
@@ -10729,7 +11399,7 @@
         <w:pStyle w:val="Compact"/>
         <w:numPr>
           <w:ilvl w:val="0"/>
-          <w:numId w:val="1074"/>
+          <w:numId w:val="1080"/>
         </w:numPr>
       </w:pPr>
       <w:r>
@@ -10749,7 +11419,7 @@
         <w:t xml:space="preserve"> </w:t>
       </w:r>
       <w:r>
-        <w:t xml:space="preserve">— Duluth’s winter warms ~1.6× faster</w:t>
+        <w:t xml:space="preserve">— Duluth’s winter warms ~1.7× faster</w:t>
       </w:r>
     </w:p>
     <w:p>
@@ -10757,7 +11427,7 @@
         <w:pStyle w:val="Compact"/>
         <w:numPr>
           <w:ilvl w:val="0"/>
-          <w:numId w:val="1074"/>
+          <w:numId w:val="1080"/>
         </w:numPr>
       </w:pPr>
       <w:r>
@@ -10782,7 +11452,7 @@
         <w:pStyle w:val="Compact"/>
         <w:numPr>
           <w:ilvl w:val="0"/>
-          <w:numId w:val="1074"/>
+          <w:numId w:val="1080"/>
         </w:numPr>
       </w:pPr>
       <w:r>
@@ -10838,29 +11508,20 @@
         <w:pStyle w:val="Compact"/>
         <w:numPr>
           <w:ilvl w:val="0"/>
-          <w:numId w:val="1075"/>
-        </w:numPr>
-      </w:pPr>
-      <w:r>
-        <w:rPr>
-          <w:rStyle w:val="VerbatimChar"/>
-        </w:rPr>
-        <w:t xml:space="preserve">get_GSOD(years =, station =)</w:t>
-      </w:r>
-      <w:r>
-        <w:t xml:space="preserve"> </w:t>
-      </w:r>
-      <w:r>
-        <w:t xml:space="preserve">and</w:t>
-      </w:r>
-      <w:r>
-        <w:t xml:space="preserve"> </w:t>
-      </w:r>
-      <w:r>
-        <w:rPr>
-          <w:rStyle w:val="VerbatimChar"/>
-        </w:rPr>
-        <w:t xml:space="preserve">nearest_stations()</w:t>
+          <w:numId w:val="1081"/>
+        </w:numPr>
+      </w:pPr>
+      <w:r>
+        <w:rPr>
+          <w:rStyle w:val="VerbatimChar"/>
+        </w:rPr>
+        <w:t xml:space="preserve">get_GSOD()</w:t>
+      </w:r>
+      <w:r>
+        <w:t xml:space="preserve"> </w:t>
+      </w:r>
+      <w:r>
+        <w:t xml:space="preserve">— Duluth, by station ID</w:t>
       </w:r>
     </w:p>
     <w:p>
@@ -10868,7 +11529,28 @@
         <w:pStyle w:val="Compact"/>
         <w:numPr>
           <w:ilvl w:val="0"/>
-          <w:numId w:val="1075"/>
+          <w:numId w:val="1081"/>
+        </w:numPr>
+      </w:pPr>
+      <w:r>
+        <w:rPr>
+          <w:rStyle w:val="VerbatimChar"/>
+        </w:rPr>
+        <w:t xml:space="preserve">get_power()</w:t>
+      </w:r>
+      <w:r>
+        <w:t xml:space="preserve"> </w:t>
+      </w:r>
+      <w:r>
+        <w:t xml:space="preserve">— anywhere, by coordinates</w:t>
+      </w:r>
+    </w:p>
+    <w:p>
+      <w:pPr>
+        <w:pStyle w:val="Compact"/>
+        <w:numPr>
+          <w:ilvl w:val="0"/>
+          <w:numId w:val="1081"/>
         </w:numPr>
       </w:pPr>
       <w:r>
@@ -10881,7 +11563,7 @@
         <w:t xml:space="preserve"> </w:t>
       </w:r>
       <w:r>
-        <w:t xml:space="preserve">— lower-case names, once, at the top</w:t>
+        <w:t xml:space="preserve">— lower-case names, once</w:t>
       </w:r>
     </w:p>
     <w:p>
@@ -10889,7 +11571,7 @@
         <w:pStyle w:val="Compact"/>
         <w:numPr>
           <w:ilvl w:val="0"/>
-          <w:numId w:val="1075"/>
+          <w:numId w:val="1081"/>
         </w:numPr>
       </w:pPr>
       <w:r>
@@ -10917,7 +11599,7 @@
         <w:t xml:space="preserve"> </w:t>
       </w:r>
       <w:r>
-        <w:t xml:space="preserve">— to the right level</w:t>
+        <w:t xml:space="preserve">— the right level</w:t>
       </w:r>
     </w:p>
     <w:p>
@@ -10925,7 +11607,7 @@
         <w:pStyle w:val="Compact"/>
         <w:numPr>
           <w:ilvl w:val="0"/>
-          <w:numId w:val="1075"/>
+          <w:numId w:val="1081"/>
         </w:numPr>
       </w:pPr>
       <w:r>
@@ -10946,7 +11628,7 @@
         <w:pStyle w:val="Compact"/>
         <w:numPr>
           <w:ilvl w:val="0"/>
-          <w:numId w:val="1075"/>
+          <w:numId w:val="1081"/>
         </w:numPr>
       </w:pPr>
       <w:r>
@@ -10956,25 +11638,16 @@
         <w:t xml:space="preserve">lm(temp ~ year)</w:t>
       </w:r>
       <w:r>
-        <w:t xml:space="preserve"> </w:t>
-      </w:r>
-      <w:r>
-        <w:t xml:space="preserve">+</w:t>
-      </w:r>
-      <w:r>
-        <w:t xml:space="preserve"> </w:t>
-      </w:r>
-      <w:r>
-        <w:rPr>
-          <w:rStyle w:val="VerbatimChar"/>
-        </w:rPr>
-        <w:t xml:space="preserve">summary()</w:t>
-      </w:r>
-      <w:r>
-        <w:t xml:space="preserve"> </w:t>
-      </w:r>
-      <w:r>
-        <w:t xml:space="preserve">— the rate</w:t>
+        <w:t xml:space="preserve">,</w:t>
+      </w:r>
+      <w:r>
+        <w:t xml:space="preserve"> </w:t>
+      </w:r>
+      <w:r>
+        <w:rPr>
+          <w:rStyle w:val="VerbatimChar"/>
+        </w:rPr>
+        <w:t xml:space="preserve">lm(temp ~ year * station)</w:t>
       </w:r>
     </w:p>
     <w:p>
@@ -10992,20 +11665,7 @@
         <w:t xml:space="preserve"> </w:t>
       </w:r>
       <w:r>
-        <w:t xml:space="preserve">your finished activity script, plus the warming rate you found for</w:t>
-      </w:r>
-      <w:r>
-        <w:t xml:space="preserve"> </w:t>
-      </w:r>
-      <w:r>
-        <w:rPr>
-          <w:b/>
-          <w:bCs/>
-        </w:rPr>
-        <w:t xml:space="preserve">your own city</w:t>
-      </w:r>
-      <w:r>
-        <w:t xml:space="preserve">.</w:t>
+        <w:t xml:space="preserve">your finished activity script, plus the homework — your own city’s warming rate and how it compares with Duluth’s.</w:t>
       </w:r>
     </w:p>
     <w:p>
@@ -11025,7 +11685,7 @@
         <w:pStyle w:val="Compact"/>
         <w:numPr>
           <w:ilvl w:val="0"/>
-          <w:numId w:val="1076"/>
+          <w:numId w:val="1082"/>
         </w:numPr>
       </w:pPr>
       <w:r>
@@ -11037,7 +11697,7 @@
         <w:pStyle w:val="Compact"/>
         <w:numPr>
           <w:ilvl w:val="0"/>
-          <w:numId w:val="1076"/>
+          <w:numId w:val="1082"/>
         </w:numPr>
       </w:pPr>
       <w:r>
@@ -11049,7 +11709,7 @@
         <w:pStyle w:val="Compact"/>
         <w:numPr>
           <w:ilvl w:val="0"/>
-          <w:numId w:val="1076"/>
+          <w:numId w:val="1082"/>
         </w:numPr>
       </w:pPr>
       <w:r>
@@ -11067,6 +11727,27 @@
     </w:p>
     <w:p>
       <w:pPr>
+        <w:pStyle w:val="Compact"/>
+        <w:numPr>
+          <w:ilvl w:val="0"/>
+          <w:numId w:val="1082"/>
+        </w:numPr>
+      </w:pPr>
+      <w:r>
+        <w:t xml:space="preserve">NASA POWER —</w:t>
+      </w:r>
+      <w:r>
+        <w:t xml:space="preserve"> </w:t>
+      </w:r>
+      <w:r>
+        <w:rPr>
+          <w:rStyle w:val="VerbatimChar"/>
+        </w:rPr>
+        <w:t xml:space="preserve">power.larc.nasa.gov</w:t>
+      </w:r>
+    </w:p>
+    <w:p>
+      <w:pPr>
         <w:pStyle w:val="FirstParagraph"/>
       </w:pPr>
       <w:r>
@@ -11082,7 +11763,7 @@
         <w:pStyle w:val="Compact"/>
         <w:numPr>
           <w:ilvl w:val="0"/>
-          <w:numId w:val="1077"/>
+          <w:numId w:val="1083"/>
         </w:numPr>
       </w:pPr>
       <w:r>
@@ -11110,14 +11791,14 @@
         <w:pStyle w:val="Compact"/>
         <w:numPr>
           <w:ilvl w:val="0"/>
-          <w:numId w:val="1077"/>
+          <w:numId w:val="1083"/>
         </w:numPr>
       </w:pPr>
       <w:r>
         <w:t xml:space="preserve">Download → clean → summarize → plot → model → report</w:t>
       </w:r>
     </w:p>
-    <w:bookmarkEnd w:id="71"/>
+    <w:bookmarkEnd w:id="72"/>
     <w:sectPr>
       <w:pgSz w:h="15840" w:w="12240"/>
       <w:pgMar w:bottom="720" w:footer="432" w:gutter="0" w:header="432" w:left="720" w:right="1008" w:top="720"/>
@@ -11565,6 +12246,12 @@
     <w:abstractNumId w:val="991"/>
   </w:num>
   <w:num w:numId="1049">
+    <w:abstractNumId w:val="991"/>
+  </w:num>
+  <w:num w:numId="1050">
+    <w:abstractNumId w:val="991"/>
+  </w:num>
+  <w:num w:numId="1051">
     <w:abstractNumId w:val="99411"/>
     <w:lvlOverride w:ilvl="0">
       <w:startOverride w:val="1"/>
@@ -11593,12 +12280,6 @@
     <w:lvlOverride w:ilvl="8">
       <w:startOverride w:val="1"/>
     </w:lvlOverride>
-  </w:num>
-  <w:num w:numId="1050">
-    <w:abstractNumId w:val="991"/>
-  </w:num>
-  <w:num w:numId="1051">
-    <w:abstractNumId w:val="991"/>
   </w:num>
   <w:num w:numId="1052">
     <w:abstractNumId w:val="991"/>
@@ -11676,6 +12357,24 @@
     <w:abstractNumId w:val="991"/>
   </w:num>
   <w:num w:numId="1077">
+    <w:abstractNumId w:val="991"/>
+  </w:num>
+  <w:num w:numId="1078">
+    <w:abstractNumId w:val="991"/>
+  </w:num>
+  <w:num w:numId="1079">
+    <w:abstractNumId w:val="991"/>
+  </w:num>
+  <w:num w:numId="1080">
+    <w:abstractNumId w:val="991"/>
+  </w:num>
+  <w:num w:numId="1081">
+    <w:abstractNumId w:val="991"/>
+  </w:num>
+  <w:num w:numId="1082">
+    <w:abstractNumId w:val="991"/>
+  </w:num>
+  <w:num w:numId="1083">
     <w:abstractNumId w:val="991"/>
   </w:num>
 </w:numbering>

</xml_diff>